<commit_message>
docs(stream-char): embed existing timer-window + response-delay diagrams in methodology
Pull the project's DOT measurement diagrams into the stream guide's Test
Methodology chapter as Figure 3.1 (Measurement Timer Windows) and Figure 3.2
(Response-Delay Latency Model). Copied source .dot + rendered .png into the guide's
own assets/dot/ (self-contained), added --assets-dir assets/dot to the generator.
Both now appear in the List of Figures.

Co-Authored-By: Claude Opus 4.8 (1M context) <noreply@anthropic.com>
Claude-Session: https://claude.ai/code/session_016YzBoFN6cxtg2ZFZ3zKjRc
</commit_message>
<xml_diff>
--- a/projects/NexysA7/stream_characterization/docs/STREAM_Characterization_Guide_v0.90.docx
+++ b/projects/NexysA7/stream_characterization/docs/STREAM_Characterization_Guide_v0.90.docx
@@ -16,7 +16,7 @@
           <wp:inline distT="0" distB="0" distL="0" distR="0">
             <wp:extent cx="2286000" cy="2286000"/>
             <wp:effectExtent l="0" t="0" r="0" b="0"/>
-            <wp:docPr id="1" name="Picture 52" descr=""/>
+            <wp:docPr id="1" name="Picture 62" descr=""/>
             <wp:cNvGraphicFramePr>
               <a:graphicFrameLocks xmlns:a="http://schemas.openxmlformats.org/drawingml/2006/main" noChangeAspect="1"/>
             </wp:cNvGraphicFramePr>
@@ -24,7 +24,7 @@
               <a:graphicData uri="http://schemas.openxmlformats.org/drawingml/2006/picture">
                 <pic:pic xmlns:pic="http://schemas.openxmlformats.org/drawingml/2006/picture">
                   <pic:nvPicPr>
-                    <pic:cNvPr id="1" name="Picture 52" descr=""/>
+                    <pic:cNvPr id="1" name="Picture 62" descr=""/>
                     <pic:cNvPicPr>
                       <a:picLocks noChangeAspect="1" noChangeArrowheads="1"/>
                     </pic:cNvPicPr>
@@ -160,7 +160,7 @@
             </w:rPr>
             <w:fldChar w:fldCharType="separate"/>
           </w:r>
-          <w:hyperlink w:anchor="__RefHeading___Toc4320_1236173374">
+          <w:hyperlink w:anchor="__RefHeading___Toc4372_2204940176">
             <w:r>
               <w:rPr>
                 <w:webHidden/>
@@ -168,7 +168,7 @@
               </w:rPr>
               <w:t>1 Document Information</w:t>
               <w:tab/>
-              <w:t>7</w:t>
+              <w:t>8</w:t>
             </w:r>
           </w:hyperlink>
         </w:p>
@@ -181,7 +181,7 @@
             </w:tabs>
             <w:rPr/>
           </w:pPr>
-          <w:hyperlink w:anchor="__RefHeading___Toc4322_1236173374">
+          <w:hyperlink w:anchor="__RefHeading___Toc4374_2204940176">
             <w:r>
               <w:rPr>
                 <w:webHidden/>
@@ -189,7 +189,7 @@
               </w:rPr>
               <w:t>1.1 References</w:t>
               <w:tab/>
-              <w:t>7</w:t>
+              <w:t>8</w:t>
             </w:r>
           </w:hyperlink>
         </w:p>
@@ -202,7 +202,7 @@
             </w:tabs>
             <w:rPr/>
           </w:pPr>
-          <w:hyperlink w:anchor="__RefHeading___Toc4324_1236173374">
+          <w:hyperlink w:anchor="__RefHeading___Toc4376_2204940176">
             <w:r>
               <w:rPr>
                 <w:webHidden/>
@@ -210,7 +210,7 @@
               </w:rPr>
               <w:t>1.2 Terminology</w:t>
               <w:tab/>
-              <w:t>7</w:t>
+              <w:t>8</w:t>
             </w:r>
           </w:hyperlink>
         </w:p>
@@ -223,7 +223,7 @@
             </w:tabs>
             <w:rPr/>
           </w:pPr>
-          <w:hyperlink w:anchor="__RefHeading___Toc4326_1236173374">
+          <w:hyperlink w:anchor="__RefHeading___Toc4378_2204940176">
             <w:r>
               <w:rPr>
                 <w:webHidden/>
@@ -231,7 +231,7 @@
               </w:rPr>
               <w:t>1.3 Revision History</w:t>
               <w:tab/>
-              <w:t>8</w:t>
+              <w:t>9</w:t>
             </w:r>
           </w:hyperlink>
         </w:p>
@@ -244,7 +244,7 @@
             </w:tabs>
             <w:rPr/>
           </w:pPr>
-          <w:hyperlink w:anchor="__RefHeading___Toc4328_1236173374">
+          <w:hyperlink w:anchor="__RefHeading___Toc4380_2204940176">
             <w:r>
               <w:rPr>
                 <w:webHidden/>
@@ -252,7 +252,7 @@
               </w:rPr>
               <w:t>2 Overview</w:t>
               <w:tab/>
-              <w:t>8</w:t>
+              <w:t>9</w:t>
             </w:r>
           </w:hyperlink>
         </w:p>
@@ -265,7 +265,7 @@
             </w:tabs>
             <w:rPr/>
           </w:pPr>
-          <w:hyperlink w:anchor="__RefHeading___Toc4330_1236173374">
+          <w:hyperlink w:anchor="__RefHeading___Toc4382_2204940176">
             <w:r>
               <w:rPr>
                 <w:webHidden/>
@@ -273,7 +273,7 @@
               </w:rPr>
               <w:t>2.1 What it characterizes</w:t>
               <w:tab/>
-              <w:t>8</w:t>
+              <w:t>9</w:t>
             </w:r>
           </w:hyperlink>
         </w:p>
@@ -286,7 +286,7 @@
             </w:tabs>
             <w:rPr/>
           </w:pPr>
-          <w:hyperlink w:anchor="__RefHeading___Toc4332_1236173374">
+          <w:hyperlink w:anchor="__RefHeading___Toc4384_2204940176">
             <w:r>
               <w:rPr>
                 <w:webHidden/>
@@ -294,7 +294,7 @@
               </w:rPr>
               <w:t>2.2 The flow matrix</w:t>
               <w:tab/>
-              <w:t>9</w:t>
+              <w:t>10</w:t>
             </w:r>
           </w:hyperlink>
         </w:p>
@@ -307,7 +307,7 @@
             </w:tabs>
             <w:rPr/>
           </w:pPr>
-          <w:hyperlink w:anchor="__RefHeading___Toc4334_1236173374">
+          <w:hyperlink w:anchor="__RefHeading___Toc4386_2204940176">
             <w:r>
               <w:rPr>
                 <w:webHidden/>
@@ -315,7 +315,7 @@
               </w:rPr>
               <w:t>2.3 Board and tools</w:t>
               <w:tab/>
-              <w:t>9</w:t>
+              <w:t>10</w:t>
             </w:r>
           </w:hyperlink>
         </w:p>
@@ -328,7 +328,7 @@
             </w:tabs>
             <w:rPr/>
           </w:pPr>
-          <w:hyperlink w:anchor="__RefHeading___Toc4336_1236173374">
+          <w:hyperlink w:anchor="__RefHeading___Toc4388_2204940176">
             <w:r>
               <w:rPr>
                 <w:webHidden/>
@@ -336,7 +336,7 @@
               </w:rPr>
               <w:t>2.4 Status</w:t>
               <w:tab/>
-              <w:t>10</w:t>
+              <w:t>11</w:t>
             </w:r>
           </w:hyperlink>
         </w:p>
@@ -349,7 +349,7 @@
             </w:tabs>
             <w:rPr/>
           </w:pPr>
-          <w:hyperlink w:anchor="__RefHeading___Toc4338_1236173374">
+          <w:hyperlink w:anchor="__RefHeading___Toc4390_2204940176">
             <w:r>
               <w:rPr>
                 <w:webHidden/>
@@ -357,7 +357,7 @@
               </w:rPr>
               <w:t>3 How It Works</w:t>
               <w:tab/>
-              <w:t>10</w:t>
+              <w:t>11</w:t>
             </w:r>
           </w:hyperlink>
         </w:p>
@@ -370,7 +370,7 @@
             </w:tabs>
             <w:rPr/>
           </w:pPr>
-          <w:hyperlink w:anchor="__RefHeading___Toc4340_1236173374">
+          <w:hyperlink w:anchor="__RefHeading___Toc4392_2204940176">
             <w:r>
               <w:rPr>
                 <w:webHidden/>
@@ -378,7 +378,7 @@
               </w:rPr>
               <w:t>3.1 The spine (primary flow)</w:t>
               <w:tab/>
-              <w:t>10</w:t>
+              <w:t>11</w:t>
             </w:r>
           </w:hyperlink>
         </w:p>
@@ -391,7 +391,7 @@
             </w:tabs>
             <w:rPr/>
           </w:pPr>
-          <w:hyperlink w:anchor="__RefHeading___Toc4342_1236173374">
+          <w:hyperlink w:anchor="__RefHeading___Toc4394_2204940176">
             <w:r>
               <w:rPr>
                 <w:webHidden/>
@@ -399,7 +399,7 @@
               </w:rPr>
               <w:t>3.1.1 Figure 2.1: STREAM Characterization Harness Spine</w:t>
               <w:tab/>
-              <w:t>10</w:t>
+              <w:t>11</w:t>
             </w:r>
           </w:hyperlink>
         </w:p>
@@ -412,7 +412,7 @@
             </w:tabs>
             <w:rPr/>
           </w:pPr>
-          <w:hyperlink w:anchor="__RefHeading___Toc4344_1236173374">
+          <w:hyperlink w:anchor="__RefHeading___Toc4396_2204940176">
             <w:r>
               <w:rPr>
                 <w:webHidden/>
@@ -420,7 +420,7 @@
               </w:rPr>
               <w:t>3.2 Bridge slaves and base addresses</w:t>
               <w:tab/>
-              <w:t>10</w:t>
+              <w:t>11</w:t>
             </w:r>
           </w:hyperlink>
         </w:p>
@@ -433,7 +433,7 @@
             </w:tabs>
             <w:rPr/>
           </w:pPr>
-          <w:hyperlink w:anchor="__RefHeading___Toc4346_1236173374">
+          <w:hyperlink w:anchor="__RefHeading___Toc4398_2204940176">
             <w:r>
               <w:rPr>
                 <w:webHidden/>
@@ -441,7 +441,7 @@
               </w:rPr>
               <w:t>3.3 Key RTL blocks</w:t>
               <w:tab/>
-              <w:t>11</w:t>
+              <w:t>12</w:t>
             </w:r>
           </w:hyperlink>
         </w:p>
@@ -454,7 +454,7 @@
             </w:tabs>
             <w:rPr/>
           </w:pPr>
-          <w:hyperlink w:anchor="__RefHeading___Toc4348_1236173374">
+          <w:hyperlink w:anchor="__RefHeading___Toc4400_2204940176">
             <w:r>
               <w:rPr>
                 <w:webHidden/>
@@ -462,7 +462,7 @@
               </w:rPr>
               <w:t>3.4 The instrumentation harness</w:t>
               <w:tab/>
-              <w:t>12</w:t>
+              <w:t>13</w:t>
             </w:r>
           </w:hyperlink>
         </w:p>
@@ -475,7 +475,7 @@
             </w:tabs>
             <w:rPr/>
           </w:pPr>
-          <w:hyperlink w:anchor="__RefHeading___Toc4350_1236173374">
+          <w:hyperlink w:anchor="__RefHeading___Toc4402_2204940176">
             <w:r>
               <w:rPr>
                 <w:webHidden/>
@@ -483,7 +483,7 @@
               </w:rPr>
               <w:t>4 Test Methodology</w:t>
               <w:tab/>
-              <w:t>12</w:t>
+              <w:t>13</w:t>
             </w:r>
           </w:hyperlink>
         </w:p>
@@ -496,7 +496,7 @@
             </w:tabs>
             <w:rPr/>
           </w:pPr>
-          <w:hyperlink w:anchor="__RefHeading___Toc4352_1236173374">
+          <w:hyperlink w:anchor="__RefHeading___Toc4404_2204940176">
             <w:r>
               <w:rPr>
                 <w:webHidden/>
@@ -504,7 +504,7 @@
               </w:rPr>
               <w:t>4.1 What is under test</w:t>
               <w:tab/>
-              <w:t>12</w:t>
+              <w:t>13</w:t>
             </w:r>
           </w:hyperlink>
         </w:p>
@@ -517,7 +517,7 @@
             </w:tabs>
             <w:rPr/>
           </w:pPr>
-          <w:hyperlink w:anchor="__RefHeading___Toc4354_1236173374">
+          <w:hyperlink w:anchor="__RefHeading___Toc4406_2204940176">
             <w:r>
               <w:rPr>
                 <w:webHidden/>
@@ -525,7 +525,49 @@
               </w:rPr>
               <w:t>4.2 What is measured, and how</w:t>
               <w:tab/>
-              <w:t>13</w:t>
+              <w:t>14</w:t>
+            </w:r>
+          </w:hyperlink>
+        </w:p>
+        <w:p>
+          <w:pPr>
+            <w:pStyle w:val="TOC3"/>
+            <w:tabs>
+              <w:tab w:val="clear" w:pos="8793"/>
+              <w:tab w:val="right" w:pos="9359" w:leader="dot"/>
+            </w:tabs>
+            <w:rPr/>
+          </w:pPr>
+          <w:hyperlink w:anchor="__RefHeading___Toc4408_2204940176">
+            <w:r>
+              <w:rPr>
+                <w:webHidden/>
+                <w:rStyle w:val="IndexLink"/>
+              </w:rPr>
+              <w:t>4.2.1 Figure 3.1: Measurement Timer Windows</w:t>
+              <w:tab/>
+              <w:t>15</w:t>
+            </w:r>
+          </w:hyperlink>
+        </w:p>
+        <w:p>
+          <w:pPr>
+            <w:pStyle w:val="TOC3"/>
+            <w:tabs>
+              <w:tab w:val="clear" w:pos="8793"/>
+              <w:tab w:val="right" w:pos="9359" w:leader="dot"/>
+            </w:tabs>
+            <w:rPr/>
+          </w:pPr>
+          <w:hyperlink w:anchor="__RefHeading___Toc4410_2204940176">
+            <w:r>
+              <w:rPr>
+                <w:webHidden/>
+                <w:rStyle w:val="IndexLink"/>
+              </w:rPr>
+              <w:t>4.2.2 Figure 3.2: Response-Delay Latency Model</w:t>
+              <w:tab/>
+              <w:t>16</w:t>
             </w:r>
           </w:hyperlink>
         </w:p>
@@ -538,7 +580,7 @@
             </w:tabs>
             <w:rPr/>
           </w:pPr>
-          <w:hyperlink w:anchor="__RefHeading___Toc4356_1236173374">
+          <w:hyperlink w:anchor="__RefHeading___Toc4412_2204940176">
             <w:r>
               <w:rPr>
                 <w:webHidden/>
@@ -546,7 +588,7 @@
               </w:rPr>
               <w:t>4.3 Workloads</w:t>
               <w:tab/>
-              <w:t>13</w:t>
+              <w:t>16</w:t>
             </w:r>
           </w:hyperlink>
         </w:p>
@@ -559,7 +601,7 @@
             </w:tabs>
             <w:rPr/>
           </w:pPr>
-          <w:hyperlink w:anchor="__RefHeading___Toc4358_1236173374">
+          <w:hyperlink w:anchor="__RefHeading___Toc4414_2204940176">
             <w:r>
               <w:rPr>
                 <w:webHidden/>
@@ -567,7 +609,7 @@
               </w:rPr>
               <w:t>4.4 The oracle</w:t>
               <w:tab/>
-              <w:t>14</w:t>
+              <w:t>16</w:t>
             </w:r>
           </w:hyperlink>
         </w:p>
@@ -580,7 +622,7 @@
             </w:tabs>
             <w:rPr/>
           </w:pPr>
-          <w:hyperlink w:anchor="__RefHeading___Toc4360_1236173374">
+          <w:hyperlink w:anchor="__RefHeading___Toc4416_2204940176">
             <w:r>
               <w:rPr>
                 <w:webHidden/>
@@ -588,7 +630,7 @@
               </w:rPr>
               <w:t>4.5 Measurement pitfalls</w:t>
               <w:tab/>
-              <w:t>14</w:t>
+              <w:t>16</w:t>
             </w:r>
           </w:hyperlink>
         </w:p>
@@ -601,7 +643,7 @@
             </w:tabs>
             <w:rPr/>
           </w:pPr>
-          <w:hyperlink w:anchor="__RefHeading___Toc4362_1236173374">
+          <w:hyperlink w:anchor="__RefHeading___Toc4418_2204940176">
             <w:r>
               <w:rPr>
                 <w:webHidden/>
@@ -609,7 +651,7 @@
               </w:rPr>
               <w:t>5 Build and Run</w:t>
               <w:tab/>
-              <w:t>14</w:t>
+              <w:t>17</w:t>
             </w:r>
           </w:hyperlink>
         </w:p>
@@ -622,7 +664,7 @@
             </w:tabs>
             <w:rPr/>
           </w:pPr>
-          <w:hyperlink w:anchor="__RefHeading___Toc4364_1236173374">
+          <w:hyperlink w:anchor="__RefHeading___Toc4420_2204940176">
             <w:r>
               <w:rPr>
                 <w:webHidden/>
@@ -630,7 +672,7 @@
               </w:rPr>
               <w:t>5.1 Make targets</w:t>
               <w:tab/>
-              <w:t>14</w:t>
+              <w:t>17</w:t>
             </w:r>
           </w:hyperlink>
         </w:p>
@@ -643,7 +685,7 @@
             </w:tabs>
             <w:rPr/>
           </w:pPr>
-          <w:hyperlink w:anchor="__RefHeading___Toc4366_1236173374">
+          <w:hyperlink w:anchor="__RefHeading___Toc4422_2204940176">
             <w:r>
               <w:rPr>
                 <w:webHidden/>
@@ -651,7 +693,7 @@
               </w:rPr>
               <w:t>5.2 Host tools (flows-stream-bridge/host/)</w:t>
               <w:tab/>
-              <w:t>15</w:t>
+              <w:t>18</w:t>
             </w:r>
           </w:hyperlink>
         </w:p>
@@ -664,7 +706,7 @@
             </w:tabs>
             <w:rPr/>
           </w:pPr>
-          <w:hyperlink w:anchor="__RefHeading___Toc4368_1236173374">
+          <w:hyperlink w:anchor="__RefHeading___Toc4424_2204940176">
             <w:r>
               <w:rPr>
                 <w:webHidden/>
@@ -672,7 +714,7 @@
               </w:rPr>
               <w:t>5.3 Port autodetect and identity</w:t>
               <w:tab/>
-              <w:t>16</w:t>
+              <w:t>18</w:t>
             </w:r>
           </w:hyperlink>
         </w:p>
@@ -685,7 +727,7 @@
             </w:tabs>
             <w:rPr/>
           </w:pPr>
-          <w:hyperlink w:anchor="__RefHeading___Toc4370_1236173374">
+          <w:hyperlink w:anchor="__RefHeading___Toc4426_2204940176">
             <w:r>
               <w:rPr>
                 <w:webHidden/>
@@ -693,7 +735,7 @@
               </w:rPr>
               <w:t>6 Harness CSR Configuration</w:t>
               <w:tab/>
-              <w:t>16</w:t>
+              <w:t>18</w:t>
             </w:r>
           </w:hyperlink>
         </w:p>
@@ -706,7 +748,7 @@
             </w:tabs>
             <w:rPr/>
           </w:pPr>
-          <w:hyperlink w:anchor="__RefHeading___Toc4372_1236173374">
+          <w:hyperlink w:anchor="__RefHeading___Toc4428_2204940176">
             <w:r>
               <w:rPr>
                 <w:webHidden/>
@@ -714,7 +756,7 @@
               </w:rPr>
               <w:t>6.1 Address map and by-name access</w:t>
               <w:tab/>
-              <w:t>16</w:t>
+              <w:t>18</w:t>
             </w:r>
           </w:hyperlink>
         </w:p>
@@ -727,7 +769,7 @@
             </w:tabs>
             <w:rPr/>
           </w:pPr>
-          <w:hyperlink w:anchor="__RefHeading___Toc4374_1236173374">
+          <w:hyperlink w:anchor="__RefHeading___Toc4430_2204940176">
             <w:r>
               <w:rPr>
                 <w:webHidden/>
@@ -735,7 +777,7 @@
               </w:rPr>
               <w:t>6.1.1 Waveform 5.1: Descriptor Load and Kick</w:t>
               <w:tab/>
-              <w:t>16</w:t>
+              <w:t>19</w:t>
             </w:r>
           </w:hyperlink>
         </w:p>
@@ -748,7 +790,7 @@
             </w:tabs>
             <w:rPr/>
           </w:pPr>
-          <w:hyperlink w:anchor="__RefHeading___Toc4376_1236173374">
+          <w:hyperlink w:anchor="__RefHeading___Toc4432_2204940176">
             <w:r>
               <w:rPr>
                 <w:webHidden/>
@@ -756,7 +798,7 @@
               </w:rPr>
               <w:t>6.2 harness_csr — control / status (base 0x0001_0000)</w:t>
               <w:tab/>
-              <w:t>17</w:t>
+              <w:t>19</w:t>
             </w:r>
           </w:hyperlink>
         </w:p>
@@ -769,7 +811,7 @@
             </w:tabs>
             <w:rPr/>
           </w:pPr>
-          <w:hyperlink w:anchor="__RefHeading___Toc4378_1236173374">
+          <w:hyperlink w:anchor="__RefHeading___Toc4434_2204940176">
             <w:r>
               <w:rPr>
                 <w:webHidden/>
@@ -777,7 +819,7 @@
               </w:rPr>
               <w:t>6.3 Timer and the latency knob</w:t>
               <w:tab/>
-              <w:t>18</w:t>
+              <w:t>20</w:t>
             </w:r>
           </w:hyperlink>
         </w:p>
@@ -790,7 +832,7 @@
             </w:tabs>
             <w:rPr/>
           </w:pPr>
-          <w:hyperlink w:anchor="__RefHeading___Toc4380_1236173374">
+          <w:hyperlink w:anchor="__RefHeading___Toc4436_2204940176">
             <w:r>
               <w:rPr>
                 <w:webHidden/>
@@ -798,7 +840,7 @@
               </w:rPr>
               <w:t>6.4 CRC, kick, and observability</w:t>
               <w:tab/>
-              <w:t>18</w:t>
+              <w:t>21</w:t>
             </w:r>
           </w:hyperlink>
         </w:p>
@@ -811,7 +853,7 @@
             </w:tabs>
             <w:rPr/>
           </w:pPr>
-          <w:hyperlink w:anchor="__RefHeading___Toc4382_1236173374">
+          <w:hyperlink w:anchor="__RefHeading___Toc4438_2204940176">
             <w:r>
               <w:rPr>
                 <w:webHidden/>
@@ -819,7 +861,7 @@
               </w:rPr>
               <w:t>6.5 STREAM monitor window (0x1000)</w:t>
               <w:tab/>
-              <w:t>19</w:t>
+              <w:t>22</w:t>
             </w:r>
           </w:hyperlink>
         </w:p>
@@ -832,7 +874,7 @@
             </w:tabs>
             <w:rPr/>
           </w:pPr>
-          <w:hyperlink w:anchor="__RefHeading___Toc4384_1236173374">
+          <w:hyperlink w:anchor="__RefHeading___Toc4440_2204940176">
             <w:r>
               <w:rPr>
                 <w:webHidden/>
@@ -840,7 +882,7 @@
               </w:rPr>
               <w:t>6.6 Descriptor format (desc_ram @ 0x0002_0000)</w:t>
               <w:tab/>
-              <w:t>19</w:t>
+              <w:t>22</w:t>
             </w:r>
           </w:hyperlink>
         </w:p>
@@ -853,7 +895,7 @@
             </w:tabs>
             <w:rPr/>
           </w:pPr>
-          <w:hyperlink w:anchor="__RefHeading___Toc4386_1236173374">
+          <w:hyperlink w:anchor="__RefHeading___Toc4442_2204940176">
             <w:r>
               <w:rPr>
                 <w:webHidden/>
@@ -861,7 +903,7 @@
               </w:rPr>
               <w:t>7 Simulation / Silicon Equivalence</w:t>
               <w:tab/>
-              <w:t>20</w:t>
+              <w:t>22</w:t>
             </w:r>
           </w:hyperlink>
         </w:p>
@@ -874,7 +916,7 @@
             </w:tabs>
             <w:rPr/>
           </w:pPr>
-          <w:hyperlink w:anchor="__RefHeading___Toc4388_1236173374">
+          <w:hyperlink w:anchor="__RefHeading___Toc4444_2204940176">
             <w:r>
               <w:rPr>
                 <w:webHidden/>
@@ -882,7 +924,7 @@
               </w:rPr>
               <w:t>7.1 The testbench</w:t>
               <w:tab/>
-              <w:t>20</w:t>
+              <w:t>22</w:t>
             </w:r>
           </w:hyperlink>
         </w:p>
@@ -895,7 +937,7 @@
             </w:tabs>
             <w:rPr/>
           </w:pPr>
-          <w:hyperlink w:anchor="__RefHeading___Toc4390_1236173374">
+          <w:hyperlink w:anchor="__RefHeading___Toc4446_2204940176">
             <w:r>
               <w:rPr>
                 <w:webHidden/>
@@ -903,7 +945,7 @@
               </w:rPr>
               <w:t>7.2 Test levels</w:t>
               <w:tab/>
-              <w:t>20</w:t>
+              <w:t>23</w:t>
             </w:r>
           </w:hyperlink>
         </w:p>
@@ -916,7 +958,7 @@
             </w:tabs>
             <w:rPr/>
           </w:pPr>
-          <w:hyperlink w:anchor="__RefHeading___Toc4392_1236173374">
+          <w:hyperlink w:anchor="__RefHeading___Toc4448_2204940176">
             <w:r>
               <w:rPr>
                 <w:webHidden/>
@@ -924,7 +966,7 @@
               </w:rPr>
               <w:t>7.3 Sibling flows</w:t>
               <w:tab/>
-              <w:t>21</w:t>
+              <w:t>23</w:t>
             </w:r>
           </w:hyperlink>
         </w:p>
@@ -937,7 +979,7 @@
             </w:tabs>
             <w:rPr/>
           </w:pPr>
-          <w:hyperlink w:anchor="__RefHeading___Toc4394_1236173374">
+          <w:hyperlink w:anchor="__RefHeading___Toc4450_2204940176">
             <w:r>
               <w:rPr>
                 <w:webHidden/>
@@ -945,7 +987,7 @@
               </w:rPr>
               <w:t>8 Troubleshooting</w:t>
               <w:tab/>
-              <w:t>21</w:t>
+              <w:t>23</w:t>
             </w:r>
           </w:hyperlink>
         </w:p>
@@ -958,7 +1000,7 @@
             </w:tabs>
             <w:rPr/>
           </w:pPr>
-          <w:hyperlink w:anchor="__RefHeading___Toc4396_1236173374">
+          <w:hyperlink w:anchor="__RefHeading___Toc4452_2204940176">
             <w:r>
               <w:rPr>
                 <w:webHidden/>
@@ -966,7 +1008,7 @@
               </w:rPr>
               <w:t>8.1 Current state</w:t>
               <w:tab/>
-              <w:t>21</w:t>
+              <w:t>23</w:t>
             </w:r>
           </w:hyperlink>
         </w:p>
@@ -979,7 +1021,7 @@
             </w:tabs>
             <w:rPr/>
           </w:pPr>
-          <w:hyperlink w:anchor="__RefHeading___Toc4398_1236173374">
+          <w:hyperlink w:anchor="__RefHeading___Toc4454_2204940176">
             <w:r>
               <w:rPr>
                 <w:webHidden/>
@@ -987,7 +1029,7 @@
               </w:rPr>
               <w:t>8.2 Known issues</w:t>
               <w:tab/>
-              <w:t>21</w:t>
+              <w:t>24</w:t>
             </w:r>
           </w:hyperlink>
         </w:p>
@@ -1000,7 +1042,7 @@
             </w:tabs>
             <w:rPr/>
           </w:pPr>
-          <w:hyperlink w:anchor="__RefHeading___Toc4400_1236173374">
+          <w:hyperlink w:anchor="__RefHeading___Toc4456_2204940176">
             <w:r>
               <w:rPr>
                 <w:webHidden/>
@@ -1008,7 +1050,7 @@
               </w:rPr>
               <w:t>8.3 Cannot find the board</w:t>
               <w:tab/>
-              <w:t>22</w:t>
+              <w:t>24</w:t>
             </w:r>
           </w:hyperlink>
         </w:p>
@@ -1021,7 +1063,7 @@
             </w:tabs>
             <w:rPr/>
           </w:pPr>
-          <w:hyperlink w:anchor="__RefHeading___Toc4402_1236173374">
+          <w:hyperlink w:anchor="__RefHeading___Toc4458_2204940176">
             <w:r>
               <w:rPr>
                 <w:webHidden/>
@@ -1029,7 +1071,7 @@
               </w:rPr>
               <w:t>8.4 Not simulatable</w:t>
               <w:tab/>
-              <w:t>22</w:t>
+              <w:t>24</w:t>
             </w:r>
           </w:hyperlink>
         </w:p>
@@ -1042,7 +1084,7 @@
             </w:tabs>
             <w:rPr/>
           </w:pPr>
-          <w:hyperlink w:anchor="__RefHeading___Toc4404_1236173374">
+          <w:hyperlink w:anchor="__RefHeading___Toc4460_2204940176">
             <w:r>
               <w:rPr>
                 <w:webHidden/>
@@ -1050,7 +1092,7 @@
               </w:rPr>
               <w:t>8.5 Board fit vs sim geometry</w:t>
               <w:tab/>
-              <w:t>22</w:t>
+              <w:t>24</w:t>
             </w:r>
           </w:hyperlink>
         </w:p>
@@ -1063,7 +1105,7 @@
             </w:tabs>
             <w:rPr/>
           </w:pPr>
-          <w:hyperlink w:anchor="__RefHeading___Toc4406_1236173374">
+          <w:hyperlink w:anchor="__RefHeading___Toc4462_2204940176">
             <w:r>
               <w:rPr>
                 <w:webHidden/>
@@ -1071,7 +1113,7 @@
               </w:rPr>
               <w:t>8.6 Which README to trust</w:t>
               <w:tab/>
-              <w:t>22</w:t>
+              <w:t>25</w:t>
             </w:r>
           </w:hyperlink>
           <w:r>
@@ -1158,7 +1200,121 @@
           <w:rPr>
             <w:rStyle w:val="ListLabel1"/>
           </w:rPr>
-          <w:t>10</w:t>
+          <w:t>11</w:t>
+        </w:r>
+        <w:r>
+          <w:rPr>
+            <w:rStyle w:val="ListLabel1"/>
+          </w:rPr>
+          <w:fldChar w:fldCharType="end"/>
+        </w:r>
+      </w:hyperlink>
+    </w:p>
+    <w:p>
+      <w:pPr>
+        <w:pStyle w:val="Normal"/>
+        <w:tabs>
+          <w:tab w:val="clear" w:pos="720"/>
+          <w:tab w:val="right" w:pos="9360" w:leader="dot"/>
+        </w:tabs>
+        <w:spacing w:before="0" w:after="0"/>
+        <w:rPr/>
+      </w:pPr>
+      <w:hyperlink w:anchor="_Fig_2_Measurement_Timer_Wi">
+        <w:r>
+          <w:rPr>
+            <w:rStyle w:val="ListLabel1"/>
+            <w:color w:val="000000"/>
+            <w:sz w:val="24"/>
+          </w:rPr>
+          <w:t>Figure 3.1: Measurement Timer Windows</w:t>
+        </w:r>
+        <w:r>
+          <w:rPr>
+            <w:rStyle w:val="ListLabel1"/>
+          </w:rPr>
+          <w:tab/>
+        </w:r>
+        <w:r>
+          <w:rPr>
+            <w:rStyle w:val="ListLabel1"/>
+          </w:rPr>
+          <w:fldChar w:fldCharType="begin"/>
+        </w:r>
+        <w:r>
+          <w:rPr>
+            <w:rStyle w:val="ListLabel1"/>
+          </w:rPr>
+          <w:instrText xml:space="preserve"> PAGEREF _Fig_2_Measurement_Timer_Wi \h </w:instrText>
+        </w:r>
+        <w:r>
+          <w:rPr>
+            <w:rStyle w:val="ListLabel1"/>
+          </w:rPr>
+          <w:fldChar w:fldCharType="separate"/>
+        </w:r>
+        <w:r>
+          <w:rPr>
+            <w:rStyle w:val="ListLabel1"/>
+          </w:rPr>
+          <w:t>15</w:t>
+        </w:r>
+        <w:r>
+          <w:rPr>
+            <w:rStyle w:val="ListLabel1"/>
+          </w:rPr>
+          <w:fldChar w:fldCharType="end"/>
+        </w:r>
+      </w:hyperlink>
+    </w:p>
+    <w:p>
+      <w:pPr>
+        <w:pStyle w:val="Normal"/>
+        <w:tabs>
+          <w:tab w:val="clear" w:pos="720"/>
+          <w:tab w:val="right" w:pos="9360" w:leader="dot"/>
+        </w:tabs>
+        <w:spacing w:before="0" w:after="0"/>
+        <w:rPr/>
+      </w:pPr>
+      <w:hyperlink w:anchor="_Fig_3_Response_Delay_Laten">
+        <w:r>
+          <w:rPr>
+            <w:rStyle w:val="ListLabel1"/>
+            <w:color w:val="000000"/>
+            <w:sz w:val="24"/>
+          </w:rPr>
+          <w:t>Figure 3.2: Response-Delay Latency Model</w:t>
+        </w:r>
+        <w:r>
+          <w:rPr>
+            <w:rStyle w:val="ListLabel1"/>
+          </w:rPr>
+          <w:tab/>
+        </w:r>
+        <w:r>
+          <w:rPr>
+            <w:rStyle w:val="ListLabel1"/>
+          </w:rPr>
+          <w:fldChar w:fldCharType="begin"/>
+        </w:r>
+        <w:r>
+          <w:rPr>
+            <w:rStyle w:val="ListLabel1"/>
+          </w:rPr>
+          <w:instrText xml:space="preserve"> PAGEREF _Fig_3_Response_Delay_Laten \h </w:instrText>
+        </w:r>
+        <w:r>
+          <w:rPr>
+            <w:rStyle w:val="ListLabel1"/>
+          </w:rPr>
+          <w:fldChar w:fldCharType="separate"/>
+        </w:r>
+        <w:r>
+          <w:rPr>
+            <w:rStyle w:val="ListLabel1"/>
+          </w:rPr>
+          <w:t>16</w:t>
         </w:r>
         <w:r>
           <w:rPr>
@@ -1243,7 +1399,7 @@
           <w:rPr>
             <w:rStyle w:val="ListLabel1"/>
           </w:rPr>
-          <w:t>7</w:t>
+          <w:t>8</w:t>
         </w:r>
         <w:r>
           <w:rPr>
@@ -1300,7 +1456,7 @@
           <w:rPr>
             <w:rStyle w:val="ListLabel1"/>
           </w:rPr>
-          <w:t>8</w:t>
+          <w:t>9</w:t>
         </w:r>
         <w:r>
           <w:rPr>
@@ -1357,7 +1513,7 @@
           <w:rPr>
             <w:rStyle w:val="ListLabel1"/>
           </w:rPr>
-          <w:t>8</w:t>
+          <w:t>9</w:t>
         </w:r>
         <w:r>
           <w:rPr>
@@ -1414,7 +1570,7 @@
           <w:rPr>
             <w:rStyle w:val="ListLabel1"/>
           </w:rPr>
-          <w:t>9</w:t>
+          <w:t>10</w:t>
         </w:r>
         <w:r>
           <w:rPr>
@@ -1471,7 +1627,7 @@
           <w:rPr>
             <w:rStyle w:val="ListLabel1"/>
           </w:rPr>
-          <w:t>9</w:t>
+          <w:t>10</w:t>
         </w:r>
         <w:r>
           <w:rPr>
@@ -1528,7 +1684,7 @@
           <w:rPr>
             <w:rStyle w:val="ListLabel1"/>
           </w:rPr>
-          <w:t>10</w:t>
+          <w:t>11</w:t>
         </w:r>
         <w:r>
           <w:rPr>
@@ -1585,7 +1741,7 @@
           <w:rPr>
             <w:rStyle w:val="ListLabel1"/>
           </w:rPr>
-          <w:t>11</w:t>
+          <w:t>12</w:t>
         </w:r>
         <w:r>
           <w:rPr>
@@ -1642,7 +1798,7 @@
           <w:rPr>
             <w:rStyle w:val="ListLabel1"/>
           </w:rPr>
-          <w:t>13</w:t>
+          <w:t>14</w:t>
         </w:r>
         <w:r>
           <w:rPr>
@@ -1699,7 +1855,7 @@
           <w:rPr>
             <w:rStyle w:val="ListLabel1"/>
           </w:rPr>
-          <w:t>13</w:t>
+          <w:t>16</w:t>
         </w:r>
         <w:r>
           <w:rPr>
@@ -1756,7 +1912,7 @@
           <w:rPr>
             <w:rStyle w:val="ListLabel1"/>
           </w:rPr>
-          <w:t>14</w:t>
+          <w:t>17</w:t>
         </w:r>
         <w:r>
           <w:rPr>
@@ -1813,7 +1969,7 @@
           <w:rPr>
             <w:rStyle w:val="ListLabel1"/>
           </w:rPr>
-          <w:t>17</w:t>
+          <w:t>19</w:t>
         </w:r>
         <w:r>
           <w:rPr>
@@ -1870,7 +2026,7 @@
           <w:rPr>
             <w:rStyle w:val="ListLabel1"/>
           </w:rPr>
-          <w:t>18</w:t>
+          <w:t>20</w:t>
         </w:r>
         <w:r>
           <w:rPr>
@@ -1927,7 +2083,7 @@
           <w:rPr>
             <w:rStyle w:val="ListLabel1"/>
           </w:rPr>
-          <w:t>18</w:t>
+          <w:t>21</w:t>
         </w:r>
         <w:r>
           <w:rPr>
@@ -1984,7 +2140,7 @@
           <w:rPr>
             <w:rStyle w:val="ListLabel1"/>
           </w:rPr>
-          <w:t>20</w:t>
+          <w:t>23</w:t>
         </w:r>
         <w:r>
           <w:rPr>
@@ -2041,7 +2197,7 @@
           <w:rPr>
             <w:rStyle w:val="ListLabel1"/>
           </w:rPr>
-          <w:t>21</w:t>
+          <w:t>24</w:t>
         </w:r>
         <w:r>
           <w:rPr>
@@ -2126,7 +2282,7 @@
           <w:rPr>
             <w:rStyle w:val="ListLabel1"/>
           </w:rPr>
-          <w:t>16</w:t>
+          <w:t>19</w:t>
         </w:r>
         <w:r>
           <w:rPr>
@@ -2241,7 +2397,7 @@
         <w:spacing w:before="360" w:after="120"/>
         <w:rPr/>
       </w:pPr>
-      <w:bookmarkStart w:id="0" w:name="__RefHeading___Toc4320_1236173374"/>
+      <w:bookmarkStart w:id="0" w:name="__RefHeading___Toc4372_2204940176"/>
       <w:bookmarkEnd w:id="0"/>
       <w:r>
         <w:rPr>
@@ -2436,7 +2592,7 @@
         <w:spacing w:before="280" w:after="80"/>
         <w:rPr/>
       </w:pPr>
-      <w:bookmarkStart w:id="1" w:name="__RefHeading___Toc4322_1236173374"/>
+      <w:bookmarkStart w:id="1" w:name="__RefHeading___Toc4374_2204940176"/>
       <w:bookmarkStart w:id="2" w:name="references"/>
       <w:bookmarkEnd w:id="1"/>
       <w:r>
@@ -3024,7 +3180,7 @@
         <w:spacing w:before="280" w:after="80"/>
         <w:rPr/>
       </w:pPr>
-      <w:bookmarkStart w:id="5" w:name="__RefHeading___Toc4324_1236173374"/>
+      <w:bookmarkStart w:id="5" w:name="__RefHeading___Toc4376_2204940176"/>
       <w:bookmarkStart w:id="6" w:name="terminology"/>
       <w:bookmarkEnd w:id="5"/>
       <w:r>
@@ -3294,7 +3450,7 @@
         <w:spacing w:before="280" w:after="80"/>
         <w:rPr/>
       </w:pPr>
-      <w:bookmarkStart w:id="8" w:name="__RefHeading___Toc4326_1236173374"/>
+      <w:bookmarkStart w:id="8" w:name="__RefHeading___Toc4378_2204940176"/>
       <w:bookmarkEnd w:id="8"/>
       <w:r>
         <w:rPr>
@@ -3568,7 +3724,7 @@
         <w:spacing w:before="360" w:after="120"/>
         <w:rPr/>
       </w:pPr>
-      <w:bookmarkStart w:id="12" w:name="__RefHeading___Toc4328_1236173374"/>
+      <w:bookmarkStart w:id="12" w:name="__RefHeading___Toc4380_2204940176"/>
       <w:bookmarkEnd w:id="12"/>
       <w:r>
         <w:rPr>
@@ -3598,7 +3754,7 @@
         <w:spacing w:before="280" w:after="80"/>
         <w:rPr/>
       </w:pPr>
-      <w:bookmarkStart w:id="13" w:name="__RefHeading___Toc4330_1236173374"/>
+      <w:bookmarkStart w:id="13" w:name="__RefHeading___Toc4382_2204940176"/>
       <w:bookmarkEnd w:id="13"/>
       <w:r>
         <w:rPr>
@@ -4199,7 +4355,7 @@
         <w:spacing w:before="280" w:after="80"/>
         <w:rPr/>
       </w:pPr>
-      <w:bookmarkStart w:id="16" w:name="__RefHeading___Toc4332_1236173374"/>
+      <w:bookmarkStart w:id="16" w:name="__RefHeading___Toc4384_2204940176"/>
       <w:bookmarkEnd w:id="16"/>
       <w:r>
         <w:rPr>
@@ -4881,7 +5037,7 @@
         <w:spacing w:before="280" w:after="80"/>
         <w:rPr/>
       </w:pPr>
-      <w:bookmarkStart w:id="18" w:name="__RefHeading___Toc4334_1236173374"/>
+      <w:bookmarkStart w:id="18" w:name="__RefHeading___Toc4386_2204940176"/>
       <w:bookmarkEnd w:id="18"/>
       <w:r>
         <w:rPr>
@@ -5322,7 +5478,7 @@
         <w:spacing w:before="280" w:after="80"/>
         <w:rPr/>
       </w:pPr>
-      <w:bookmarkStart w:id="21" w:name="__RefHeading___Toc4336_1236173374"/>
+      <w:bookmarkStart w:id="21" w:name="__RefHeading___Toc4388_2204940176"/>
       <w:bookmarkEnd w:id="21"/>
       <w:r>
         <w:rPr>
@@ -5414,7 +5570,7 @@
         <w:spacing w:before="360" w:after="120"/>
         <w:rPr/>
       </w:pPr>
-      <w:bookmarkStart w:id="22" w:name="__RefHeading___Toc4338_1236173374"/>
+      <w:bookmarkStart w:id="22" w:name="__RefHeading___Toc4390_2204940176"/>
       <w:bookmarkStart w:id="23" w:name="how-it-works"/>
       <w:bookmarkEnd w:id="22"/>
       <w:r>
@@ -5445,7 +5601,7 @@
         <w:spacing w:before="280" w:after="80"/>
         <w:rPr/>
       </w:pPr>
-      <w:bookmarkStart w:id="24" w:name="__RefHeading___Toc4340_1236173374"/>
+      <w:bookmarkStart w:id="24" w:name="__RefHeading___Toc4392_2204940176"/>
       <w:bookmarkStart w:id="25" w:name="the-spine-primary-flow"/>
       <w:bookmarkEnd w:id="24"/>
       <w:r>
@@ -5485,7 +5641,7 @@
         <w:spacing w:before="200" w:after="80"/>
         <w:rPr/>
       </w:pPr>
-      <w:bookmarkStart w:id="26" w:name="__RefHeading___Toc4342_1236173374"/>
+      <w:bookmarkStart w:id="26" w:name="__RefHeading___Toc4394_2204940176"/>
       <w:bookmarkStart w:id="27" w:name="X4c4c79c055bc53a305ce24ccec00278f13c0982"/>
       <w:bookmarkStart w:id="28" w:name="_Fig_1_STREAM_Characterizat"/>
       <w:bookmarkEnd w:id="26"/>
@@ -5604,7 +5760,7 @@
         <w:spacing w:before="280" w:after="80"/>
         <w:rPr/>
       </w:pPr>
-      <w:bookmarkStart w:id="29" w:name="__RefHeading___Toc4344_1236173374"/>
+      <w:bookmarkStart w:id="29" w:name="__RefHeading___Toc4396_2204940176"/>
       <w:bookmarkStart w:id="30" w:name="bridge-slaves-and-base-addresses"/>
       <w:bookmarkEnd w:id="29"/>
       <w:r>
@@ -7137,7 +7293,7 @@
         <w:spacing w:before="280" w:after="80"/>
         <w:rPr/>
       </w:pPr>
-      <w:bookmarkStart w:id="32" w:name="__RefHeading___Toc4346_1236173374"/>
+      <w:bookmarkStart w:id="32" w:name="__RefHeading___Toc4398_2204940176"/>
       <w:bookmarkEnd w:id="32"/>
       <w:r>
         <w:rPr>
@@ -7833,7 +7989,7 @@
         <w:spacing w:before="280" w:after="80"/>
         <w:rPr/>
       </w:pPr>
-      <w:bookmarkStart w:id="35" w:name="__RefHeading___Toc4348_1236173374"/>
+      <w:bookmarkStart w:id="35" w:name="__RefHeading___Toc4400_2204940176"/>
       <w:bookmarkEnd w:id="35"/>
       <w:r>
         <w:rPr>
@@ -8015,7 +8171,7 @@
         <w:spacing w:before="360" w:after="120"/>
         <w:rPr/>
       </w:pPr>
-      <w:bookmarkStart w:id="36" w:name="__RefHeading___Toc4350_1236173374"/>
+      <w:bookmarkStart w:id="36" w:name="__RefHeading___Toc4402_2204940176"/>
       <w:bookmarkStart w:id="37" w:name="test-methodology"/>
       <w:bookmarkEnd w:id="36"/>
       <w:r>
@@ -8071,7 +8227,7 @@
         <w:spacing w:before="280" w:after="80"/>
         <w:rPr/>
       </w:pPr>
-      <w:bookmarkStart w:id="38" w:name="__RefHeading___Toc4352_1236173374"/>
+      <w:bookmarkStart w:id="38" w:name="__RefHeading___Toc4404_2204940176"/>
       <w:bookmarkStart w:id="39" w:name="what-is-under-test"/>
       <w:bookmarkEnd w:id="38"/>
       <w:r>
@@ -8141,7 +8297,7 @@
         <w:spacing w:before="280" w:after="80"/>
         <w:rPr/>
       </w:pPr>
-      <w:bookmarkStart w:id="40" w:name="__RefHeading___Toc4354_1236173374"/>
+      <w:bookmarkStart w:id="40" w:name="__RefHeading___Toc4406_2204940176"/>
       <w:bookmarkStart w:id="41" w:name="what-is-measured-and-how"/>
       <w:bookmarkEnd w:id="40"/>
       <w:r>
@@ -8956,7 +9112,274 @@
         </w:rPr>
         <w:t>, …) select which MonBus cones are active.</w:t>
       </w:r>
+    </w:p>
+    <w:p>
+      <w:pPr>
+        <w:pStyle w:val="BodyText"/>
+        <w:rPr/>
+      </w:pPr>
+      <w:r>
+        <w:rPr>
+          <w:sz w:val="20"/>
+        </w:rPr>
+        <w:t>The timer captures the edges of the window — kick, first/last AR/R and W/B — so a run’s throughput and latency are derived from a well-defined interval:</w:t>
+      </w:r>
+    </w:p>
+    <w:p>
+      <w:pPr>
+        <w:pStyle w:val="Heading3"/>
+        <w:spacing w:before="200" w:after="80"/>
+        <w:rPr/>
+      </w:pPr>
+      <w:bookmarkStart w:id="43" w:name="__RefHeading___Toc4408_2204940176"/>
+      <w:bookmarkStart w:id="44" w:name="figure-3.1-measurement-timer-windows"/>
+      <w:bookmarkStart w:id="45" w:name="_Fig_2_Measurement_Timer_Wi"/>
+      <w:bookmarkEnd w:id="43"/>
+      <w:r>
+        <w:rPr>
+          <w:rStyle w:val="SectionNumber"/>
+          <w:b/>
+          <w:color w:val="404040"/>
+          <w:sz w:val="24"/>
+        </w:rPr>
+        <w:t>4.2.1</w:t>
+      </w:r>
+      <w:r>
+        <w:rPr>
+          <w:b/>
+          <w:color w:val="404040"/>
+          <w:sz w:val="24"/>
+        </w:rPr>
+        <w:tab/>
+        <w:t>Figure 3.1: Measurement Timer Windows</w:t>
+      </w:r>
+      <w:bookmarkEnd w:id="45"/>
+    </w:p>
+    <w:p>
+      <w:pPr>
+        <w:pStyle w:val="CaptionedFigure"/>
+        <w:rPr/>
+      </w:pPr>
+      <w:r>
+        <w:rPr/>
+        <w:drawing>
+          <wp:inline distT="0" distB="0" distL="0" distR="0">
+            <wp:extent cx="5334000" cy="5322570"/>
+            <wp:effectExtent l="0" t="0" r="0" b="0"/>
+            <wp:docPr id="11" name="Image2" descr="Measurement timer windows"/>
+            <wp:cNvGraphicFramePr>
+              <a:graphicFrameLocks xmlns:a="http://schemas.openxmlformats.org/drawingml/2006/main" noChangeAspect="1"/>
+            </wp:cNvGraphicFramePr>
+            <a:graphic xmlns:a="http://schemas.openxmlformats.org/drawingml/2006/main">
+              <a:graphicData uri="http://schemas.openxmlformats.org/drawingml/2006/picture">
+                <pic:pic xmlns:pic="http://schemas.openxmlformats.org/drawingml/2006/picture">
+                  <pic:nvPicPr>
+                    <pic:cNvPr id="11" name="Image2" descr="Measurement timer windows"/>
+                    <pic:cNvPicPr>
+                      <a:picLocks noChangeAspect="1" noChangeArrowheads="1"/>
+                    </pic:cNvPicPr>
+                  </pic:nvPicPr>
+                  <pic:blipFill>
+                    <a:blip r:embed="rId5"/>
+                    <a:stretch>
+                      <a:fillRect/>
+                    </a:stretch>
+                  </pic:blipFill>
+                  <pic:spPr bwMode="auto">
+                    <a:xfrm>
+                      <a:off x="0" y="0"/>
+                      <a:ext cx="5334000" cy="5322570"/>
+                    </a:xfrm>
+                    <a:prstGeom prst="rect">
+                      <a:avLst/>
+                    </a:prstGeom>
+                  </pic:spPr>
+                </pic:pic>
+              </a:graphicData>
+            </a:graphic>
+          </wp:inline>
+        </w:drawing>
+      </w:r>
+    </w:p>
+    <w:p>
+      <w:pPr>
+        <w:pStyle w:val="ImageCaption"/>
+        <w:rPr/>
+      </w:pPr>
+      <w:r>
+        <w:rPr/>
+        <w:t>Measurement timer windows</w:t>
+      </w:r>
+    </w:p>
+    <w:p>
+      <w:pPr>
+        <w:pStyle w:val="BodyText"/>
+        <w:rPr/>
+      </w:pPr>
+      <w:r>
+        <w:rPr>
+          <w:b/>
+          <w:bCs/>
+          <w:sz w:val="20"/>
+        </w:rPr>
+        <w:t>Source:</w:t>
+      </w:r>
+      <w:r>
+        <w:rPr>
+          <w:sz w:val="20"/>
+        </w:rPr>
+        <w:t xml:space="preserve"> </w:t>
+      </w:r>
+      <w:hyperlink r:id="rId6">
+        <w:r>
+          <w:rPr>
+            <w:rStyle w:val="Hyperlink"/>
+          </w:rPr>
+          <w:t>05_timer_windows.dot</w:t>
+        </w:r>
+      </w:hyperlink>
+    </w:p>
+    <w:p>
+      <w:pPr>
+        <w:pStyle w:val="BodyText"/>
+        <w:rPr/>
+      </w:pPr>
+      <w:r>
+        <w:rPr>
+          <w:sz w:val="20"/>
+        </w:rPr>
+        <w:t xml:space="preserve">The emulated memory latency is a per-beat timestamp FIFO — the </w:t>
+      </w:r>
+      <w:r>
+        <w:rPr>
+          <w:rStyle w:val="VerbatimChar"/>
+          <w:sz w:val="20"/>
+        </w:rPr>
+        <w:t>RESP_DELAY</w:t>
+      </w:r>
+      <w:r>
+        <w:rPr>
+          <w:sz w:val="20"/>
+        </w:rPr>
+        <w:t xml:space="preserve"> CSR sets how long each beat dwells before it is released to the DUT:</w:t>
+      </w:r>
+      <w:bookmarkEnd w:id="44"/>
+    </w:p>
+    <w:p>
+      <w:pPr>
+        <w:pStyle w:val="Heading3"/>
+        <w:spacing w:before="200" w:after="80"/>
+        <w:rPr/>
+      </w:pPr>
+      <w:bookmarkStart w:id="46" w:name="__RefHeading___Toc4410_2204940176"/>
+      <w:bookmarkStart w:id="47" w:name="figure-3.2-response-delay-latency-model"/>
+      <w:bookmarkStart w:id="48" w:name="_Fig_3_Response_Delay_Laten"/>
+      <w:bookmarkEnd w:id="46"/>
+      <w:r>
+        <w:rPr>
+          <w:rStyle w:val="SectionNumber"/>
+          <w:b/>
+          <w:color w:val="404040"/>
+          <w:sz w:val="24"/>
+        </w:rPr>
+        <w:t>4.2.2</w:t>
+      </w:r>
+      <w:r>
+        <w:rPr>
+          <w:b/>
+          <w:color w:val="404040"/>
+          <w:sz w:val="24"/>
+        </w:rPr>
+        <w:tab/>
+        <w:t>Figure 3.2: Response-Delay Latency Model</w:t>
+      </w:r>
+      <w:bookmarkEnd w:id="48"/>
+    </w:p>
+    <w:p>
+      <w:pPr>
+        <w:pStyle w:val="CaptionedFigure"/>
+        <w:rPr/>
+      </w:pPr>
+      <w:r>
+        <w:rPr/>
+        <w:drawing>
+          <wp:inline distT="0" distB="0" distL="0" distR="0">
+            <wp:extent cx="5334000" cy="1213485"/>
+            <wp:effectExtent l="0" t="0" r="0" b="0"/>
+            <wp:docPr id="12" name="Image3" descr="Response-delay latency model"/>
+            <wp:cNvGraphicFramePr>
+              <a:graphicFrameLocks xmlns:a="http://schemas.openxmlformats.org/drawingml/2006/main" noChangeAspect="1"/>
+            </wp:cNvGraphicFramePr>
+            <a:graphic xmlns:a="http://schemas.openxmlformats.org/drawingml/2006/main">
+              <a:graphicData uri="http://schemas.openxmlformats.org/drawingml/2006/picture">
+                <pic:pic xmlns:pic="http://schemas.openxmlformats.org/drawingml/2006/picture">
+                  <pic:nvPicPr>
+                    <pic:cNvPr id="12" name="Image3" descr="Response-delay latency model"/>
+                    <pic:cNvPicPr>
+                      <a:picLocks noChangeAspect="1" noChangeArrowheads="1"/>
+                    </pic:cNvPicPr>
+                  </pic:nvPicPr>
+                  <pic:blipFill>
+                    <a:blip r:embed="rId7"/>
+                    <a:stretch>
+                      <a:fillRect/>
+                    </a:stretch>
+                  </pic:blipFill>
+                  <pic:spPr bwMode="auto">
+                    <a:xfrm>
+                      <a:off x="0" y="0"/>
+                      <a:ext cx="5334000" cy="1213485"/>
+                    </a:xfrm>
+                    <a:prstGeom prst="rect">
+                      <a:avLst/>
+                    </a:prstGeom>
+                  </pic:spPr>
+                </pic:pic>
+              </a:graphicData>
+            </a:graphic>
+          </wp:inline>
+        </w:drawing>
+      </w:r>
+    </w:p>
+    <w:p>
+      <w:pPr>
+        <w:pStyle w:val="ImageCaption"/>
+        <w:rPr/>
+      </w:pPr>
+      <w:r>
+        <w:rPr/>
+        <w:t>Response-delay latency model</w:t>
+      </w:r>
+    </w:p>
+    <w:p>
+      <w:pPr>
+        <w:pStyle w:val="BodyText"/>
+        <w:rPr/>
+      </w:pPr>
+      <w:r>
+        <w:rPr>
+          <w:b/>
+          <w:bCs/>
+          <w:sz w:val="20"/>
+        </w:rPr>
+        <w:t>Source:</w:t>
+      </w:r>
+      <w:r>
+        <w:rPr>
+          <w:sz w:val="20"/>
+        </w:rPr>
+        <w:t xml:space="preserve"> </w:t>
+      </w:r>
+      <w:hyperlink r:id="rId8">
+        <w:r>
+          <w:rPr>
+            <w:rStyle w:val="Hyperlink"/>
+          </w:rPr>
+          <w:t>03_response_delay.dot</w:t>
+        </w:r>
+      </w:hyperlink>
       <w:bookmarkEnd w:id="41"/>
+      <w:bookmarkEnd w:id="47"/>
     </w:p>
     <w:p>
       <w:pPr>
@@ -8967,8 +9390,8 @@
         <w:spacing w:before="280" w:after="80"/>
         <w:rPr/>
       </w:pPr>
-      <w:bookmarkStart w:id="43" w:name="__RefHeading___Toc4356_1236173374"/>
-      <w:bookmarkEnd w:id="43"/>
+      <w:bookmarkStart w:id="49" w:name="__RefHeading___Toc4412_2204940176"/>
+      <w:bookmarkEnd w:id="49"/>
       <w:r>
         <w:rPr>
           <w:rStyle w:val="SectionNumber"/>
@@ -8993,12 +9416,12 @@
         <w:pStyle w:val="TableCaption"/>
         <w:rPr/>
       </w:pPr>
-      <w:bookmarkStart w:id="44" w:name="_Tab_9_Characterization_wor"/>
+      <w:bookmarkStart w:id="50" w:name="_Tab_9_Characterization_wor"/>
       <w:r>
         <w:rPr/>
         <w:t>Characterization workloads</w:t>
       </w:r>
-      <w:bookmarkEnd w:id="44"/>
+      <w:bookmarkEnd w:id="50"/>
     </w:p>
     <w:tbl>
       <w:tblPr>
@@ -9353,8 +9776,8 @@
               </w:rPr>
               <w:t>0, 128, … aclk cycles (memory-latency sweep)</w:t>
             </w:r>
-            <w:bookmarkStart w:id="45" w:name="workloads"/>
-            <w:bookmarkEnd w:id="45"/>
+            <w:bookmarkStart w:id="51" w:name="workloads"/>
+            <w:bookmarkEnd w:id="51"/>
           </w:p>
         </w:tc>
       </w:tr>
@@ -9368,8 +9791,8 @@
         <w:spacing w:before="280" w:after="80"/>
         <w:rPr/>
       </w:pPr>
-      <w:bookmarkStart w:id="46" w:name="__RefHeading___Toc4358_1236173374"/>
-      <w:bookmarkEnd w:id="46"/>
+      <w:bookmarkStart w:id="52" w:name="__RefHeading___Toc4414_2204940176"/>
+      <w:bookmarkEnd w:id="52"/>
       <w:r>
         <w:rPr>
           <w:rStyle w:val="SectionNumber"/>
@@ -9424,9 +9847,9 @@
         <w:spacing w:before="280" w:after="80"/>
         <w:rPr/>
       </w:pPr>
-      <w:bookmarkStart w:id="47" w:name="__RefHeading___Toc4360_1236173374"/>
-      <w:bookmarkStart w:id="48" w:name="measurement-pitfalls"/>
-      <w:bookmarkEnd w:id="47"/>
+      <w:bookmarkStart w:id="53" w:name="__RefHeading___Toc4416_2204940176"/>
+      <w:bookmarkStart w:id="54" w:name="measurement-pitfalls"/>
+      <w:bookmarkEnd w:id="53"/>
       <w:r>
         <w:rPr>
           <w:rStyle w:val="SectionNumber"/>
@@ -9529,7 +9952,7 @@
         <w:t xml:space="preserve"> — it bounds the debug trace, not the bus-meter counters.</w:t>
       </w:r>
       <w:bookmarkEnd w:id="37"/>
-      <w:bookmarkEnd w:id="48"/>
+      <w:bookmarkEnd w:id="54"/>
     </w:p>
     <w:p>
       <w:pPr>
@@ -9538,9 +9961,9 @@
         <w:spacing w:before="360" w:after="120"/>
         <w:rPr/>
       </w:pPr>
-      <w:bookmarkStart w:id="49" w:name="__RefHeading___Toc4362_1236173374"/>
-      <w:bookmarkStart w:id="50" w:name="build-and-run"/>
-      <w:bookmarkEnd w:id="49"/>
+      <w:bookmarkStart w:id="55" w:name="__RefHeading___Toc4418_2204940176"/>
+      <w:bookmarkStart w:id="56" w:name="build-and-run"/>
+      <w:bookmarkEnd w:id="55"/>
       <w:r>
         <w:rPr>
           <w:rStyle w:val="SectionNumber"/>
@@ -9652,9 +10075,9 @@
         <w:spacing w:before="280" w:after="80"/>
         <w:rPr/>
       </w:pPr>
-      <w:bookmarkStart w:id="51" w:name="__RefHeading___Toc4364_1236173374"/>
-      <w:bookmarkStart w:id="52" w:name="make-targets"/>
-      <w:bookmarkEnd w:id="51"/>
+      <w:bookmarkStart w:id="57" w:name="__RefHeading___Toc4420_2204940176"/>
+      <w:bookmarkStart w:id="58" w:name="make-targets"/>
+      <w:bookmarkEnd w:id="57"/>
       <w:r>
         <w:rPr>
           <w:rStyle w:val="SectionNumber"/>
@@ -9866,12 +10289,12 @@
         <w:pStyle w:val="TableCaption"/>
         <w:rPr/>
       </w:pPr>
-      <w:bookmarkStart w:id="53" w:name="_Tab_10_flows_stream_bridge_"/>
+      <w:bookmarkStart w:id="59" w:name="_Tab_10_flows_stream_bridge_"/>
       <w:r>
         <w:rPr/>
         <w:t>flows-stream-bridge make targets</w:t>
       </w:r>
-      <w:bookmarkEnd w:id="53"/>
+      <w:bookmarkEnd w:id="59"/>
     </w:p>
     <w:tbl>
       <w:tblPr>
@@ -10714,7 +11137,7 @@
         </w:rPr>
         <w:t xml:space="preserve"> sim</w:t>
       </w:r>
-      <w:bookmarkEnd w:id="52"/>
+      <w:bookmarkEnd w:id="58"/>
     </w:p>
     <w:p>
       <w:pPr>
@@ -10725,9 +11148,9 @@
         <w:spacing w:before="280" w:after="80"/>
         <w:rPr/>
       </w:pPr>
-      <w:bookmarkStart w:id="54" w:name="__RefHeading___Toc4366_1236173374"/>
-      <w:bookmarkStart w:id="55" w:name="host-tools-flows-stream-bridgehost"/>
-      <w:bookmarkEnd w:id="54"/>
+      <w:bookmarkStart w:id="60" w:name="__RefHeading___Toc4422_2204940176"/>
+      <w:bookmarkStart w:id="61" w:name="host-tools-flows-stream-bridgehost"/>
+      <w:bookmarkEnd w:id="60"/>
       <w:r>
         <w:rPr>
           <w:rStyle w:val="SectionNumber"/>
@@ -11262,7 +11685,7 @@
         </w:rPr>
         <w:t xml:space="preserve"> appendices.</w:t>
       </w:r>
-      <w:bookmarkEnd w:id="55"/>
+      <w:bookmarkEnd w:id="61"/>
     </w:p>
     <w:p>
       <w:pPr>
@@ -11273,9 +11696,9 @@
         <w:spacing w:before="280" w:after="80"/>
         <w:rPr/>
       </w:pPr>
-      <w:bookmarkStart w:id="56" w:name="__RefHeading___Toc4368_1236173374"/>
-      <w:bookmarkStart w:id="57" w:name="port-autodetect-and-identity"/>
-      <w:bookmarkEnd w:id="56"/>
+      <w:bookmarkStart w:id="62" w:name="__RefHeading___Toc4424_2204940176"/>
+      <w:bookmarkStart w:id="63" w:name="port-autodetect-and-identity"/>
+      <w:bookmarkEnd w:id="62"/>
       <w:r>
         <w:rPr>
           <w:rStyle w:val="SectionNumber"/>
@@ -11404,8 +11827,8 @@
         </w:rPr>
         <w:t xml:space="preserve"> (“STRC”).</w:t>
       </w:r>
-      <w:bookmarkEnd w:id="50"/>
-      <w:bookmarkEnd w:id="57"/>
+      <w:bookmarkEnd w:id="56"/>
+      <w:bookmarkEnd w:id="63"/>
     </w:p>
     <w:p>
       <w:pPr>
@@ -11414,9 +11837,9 @@
         <w:spacing w:before="360" w:after="120"/>
         <w:rPr/>
       </w:pPr>
-      <w:bookmarkStart w:id="58" w:name="__RefHeading___Toc4370_1236173374"/>
-      <w:bookmarkStart w:id="59" w:name="harness-csr-configuration"/>
-      <w:bookmarkEnd w:id="58"/>
+      <w:bookmarkStart w:id="64" w:name="__RefHeading___Toc4426_2204940176"/>
+      <w:bookmarkStart w:id="65" w:name="harness-csr-configuration"/>
+      <w:bookmarkEnd w:id="64"/>
       <w:r>
         <w:rPr>
           <w:rStyle w:val="SectionNumber"/>
@@ -11445,9 +11868,9 @@
         <w:spacing w:before="280" w:after="80"/>
         <w:rPr/>
       </w:pPr>
-      <w:bookmarkStart w:id="60" w:name="__RefHeading___Toc4372_1236173374"/>
-      <w:bookmarkStart w:id="61" w:name="address-map-and-by-name-access"/>
-      <w:bookmarkEnd w:id="60"/>
+      <w:bookmarkStart w:id="66" w:name="__RefHeading___Toc4428_2204940176"/>
+      <w:bookmarkStart w:id="67" w:name="address-map-and-by-name-access"/>
+      <w:bookmarkEnd w:id="66"/>
       <w:r>
         <w:rPr>
           <w:rStyle w:val="SectionNumber"/>
@@ -11741,10 +12164,10 @@
         <w:spacing w:before="200" w:after="80"/>
         <w:rPr/>
       </w:pPr>
-      <w:bookmarkStart w:id="62" w:name="__RefHeading___Toc4374_1236173374"/>
-      <w:bookmarkStart w:id="63" w:name="waveform-5.1-descriptor-load-and-kick"/>
-      <w:bookmarkStart w:id="64" w:name="_Wave_5_1_Descriptor_Load_and_"/>
-      <w:bookmarkEnd w:id="62"/>
+      <w:bookmarkStart w:id="68" w:name="__RefHeading___Toc4430_2204940176"/>
+      <w:bookmarkStart w:id="69" w:name="waveform-5.1-descriptor-load-and-kick"/>
+      <w:bookmarkStart w:id="70" w:name="_Wave_5_1_Descriptor_Load_and_"/>
+      <w:bookmarkEnd w:id="68"/>
       <w:r>
         <w:rPr>
           <w:rStyle w:val="SectionNumber"/>
@@ -11763,7 +12186,7 @@
         <w:tab/>
         <w:t>Waveform 5.1: Descriptor Load and Kick</w:t>
       </w:r>
-      <w:bookmarkEnd w:id="64"/>
+      <w:bookmarkEnd w:id="70"/>
     </w:p>
     <w:p>
       <w:pPr>
@@ -11776,7 +12199,7 @@
           <wp:inline distT="0" distB="0" distL="0" distR="0">
             <wp:extent cx="5334000" cy="2152650"/>
             <wp:effectExtent l="0" t="0" r="0" b="0"/>
-            <wp:docPr id="11" name="Image2" descr="Descriptor load and kick"/>
+            <wp:docPr id="13" name="Image4" descr="Descriptor load and kick"/>
             <wp:cNvGraphicFramePr>
               <a:graphicFrameLocks xmlns:a="http://schemas.openxmlformats.org/drawingml/2006/main" noChangeAspect="1"/>
             </wp:cNvGraphicFramePr>
@@ -11784,16 +12207,16 @@
               <a:graphicData uri="http://schemas.openxmlformats.org/drawingml/2006/picture">
                 <pic:pic xmlns:pic="http://schemas.openxmlformats.org/drawingml/2006/picture">
                   <pic:nvPicPr>
-                    <pic:cNvPr id="11" name="Image2" descr="Descriptor load and kick"/>
+                    <pic:cNvPr id="13" name="Image4" descr="Descriptor load and kick"/>
                     <pic:cNvPicPr>
                       <a:picLocks noChangeAspect="1" noChangeArrowheads="1"/>
                     </pic:cNvPicPr>
                   </pic:nvPicPr>
                   <pic:blipFill>
-                    <a:blip r:embed="rId5">
+                    <a:blip r:embed="rId9">
                       <a:extLst>
                         <a:ext uri="{96DAC541-7B7A-43D3-8B79-37D633B846F1}">
-                          <asvg:svgBlip xmlns:asvg="http://schemas.microsoft.com/office/drawing/2016/SVG/main" r:embed="rId6"/>
+                          <asvg:svgBlip xmlns:asvg="http://schemas.microsoft.com/office/drawing/2016/SVG/main" r:embed="rId10"/>
                         </a:ext>
                       </a:extLst>
                     </a:blip>
@@ -11846,7 +12269,7 @@
         </w:rPr>
         <w:t xml:space="preserve"> </w:t>
       </w:r>
-      <w:hyperlink r:id="rId7">
+      <w:hyperlink r:id="rId11">
         <w:r>
           <w:rPr>
             <w:rStyle w:val="Hyperlink"/>
@@ -11854,8 +12277,8 @@
           <w:t>01_desc_kick.json</w:t>
         </w:r>
       </w:hyperlink>
-      <w:bookmarkEnd w:id="61"/>
-      <w:bookmarkEnd w:id="63"/>
+      <w:bookmarkEnd w:id="67"/>
+      <w:bookmarkEnd w:id="69"/>
     </w:p>
     <w:p>
       <w:pPr>
@@ -11866,8 +12289,8 @@
         <w:spacing w:before="280" w:after="80"/>
         <w:rPr/>
       </w:pPr>
-      <w:bookmarkStart w:id="65" w:name="__RefHeading___Toc4376_1236173374"/>
-      <w:bookmarkEnd w:id="65"/>
+      <w:bookmarkStart w:id="71" w:name="__RefHeading___Toc4432_2204940176"/>
+      <w:bookmarkEnd w:id="71"/>
       <w:r>
         <w:rPr>
           <w:rStyle w:val="SectionNumber"/>
@@ -11892,12 +12315,12 @@
         <w:pStyle w:val="TableCaption"/>
         <w:rPr/>
       </w:pPr>
-      <w:bookmarkStart w:id="66" w:name="_Tab_11_harness_csr_control_"/>
+      <w:bookmarkStart w:id="72" w:name="_Tab_11_harness_csr_control_"/>
       <w:r>
         <w:rPr/>
         <w:t>harness_csr control / status</w:t>
       </w:r>
-      <w:bookmarkEnd w:id="66"/>
+      <w:bookmarkEnd w:id="72"/>
     </w:p>
     <w:tbl>
       <w:tblPr>
@@ -15035,8 +15458,8 @@
               </w:rPr>
               <w:t>0x5354_5243 (“STRC”)</w:t>
             </w:r>
-            <w:bookmarkStart w:id="67" w:name="Xe00dbbe59265c00ad5f56b5cba17c5337c990cf"/>
-            <w:bookmarkEnd w:id="67"/>
+            <w:bookmarkStart w:id="73" w:name="Xe00dbbe59265c00ad5f56b5cba17c5337c990cf"/>
+            <w:bookmarkEnd w:id="73"/>
           </w:p>
         </w:tc>
       </w:tr>
@@ -15050,8 +15473,8 @@
         <w:spacing w:before="280" w:after="80"/>
         <w:rPr/>
       </w:pPr>
-      <w:bookmarkStart w:id="68" w:name="__RefHeading___Toc4378_1236173374"/>
-      <w:bookmarkEnd w:id="68"/>
+      <w:bookmarkStart w:id="74" w:name="__RefHeading___Toc4434_2204940176"/>
+      <w:bookmarkEnd w:id="74"/>
       <w:r>
         <w:rPr>
           <w:rStyle w:val="SectionNumber"/>
@@ -15076,12 +15499,12 @@
         <w:pStyle w:val="TableCaption"/>
         <w:rPr/>
       </w:pPr>
-      <w:bookmarkStart w:id="69" w:name="_Tab_12_Timer_and_memory_lat"/>
+      <w:bookmarkStart w:id="75" w:name="_Tab_12_Timer_and_memory_lat"/>
       <w:r>
         <w:rPr/>
         <w:t>Timer and memory-latency registers</w:t>
       </w:r>
-      <w:bookmarkEnd w:id="69"/>
+      <w:bookmarkEnd w:id="75"/>
     </w:p>
     <w:tbl>
       <w:tblPr>
@@ -16700,8 +17123,8 @@
         <w:spacing w:before="280" w:after="80"/>
         <w:rPr/>
       </w:pPr>
-      <w:bookmarkStart w:id="70" w:name="__RefHeading___Toc4380_1236173374"/>
-      <w:bookmarkEnd w:id="70"/>
+      <w:bookmarkStart w:id="76" w:name="__RefHeading___Toc4436_2204940176"/>
+      <w:bookmarkEnd w:id="76"/>
       <w:r>
         <w:rPr>
           <w:rStyle w:val="SectionNumber"/>
@@ -16726,12 +17149,12 @@
         <w:pStyle w:val="TableCaption"/>
         <w:rPr/>
       </w:pPr>
-      <w:bookmarkStart w:id="71" w:name="_Tab_13_CRC__kick__and_obser"/>
+      <w:bookmarkStart w:id="77" w:name="_Tab_13_CRC__kick__and_obser"/>
       <w:r>
         <w:rPr/>
         <w:t>CRC, kick, and observability registers</w:t>
       </w:r>
-      <w:bookmarkEnd w:id="71"/>
+      <w:bookmarkEnd w:id="77"/>
     </w:p>
     <w:tbl>
       <w:tblPr>
@@ -18681,9 +19104,9 @@
         <w:spacing w:before="280" w:after="80"/>
         <w:rPr/>
       </w:pPr>
-      <w:bookmarkStart w:id="72" w:name="__RefHeading___Toc4382_1236173374"/>
-      <w:bookmarkStart w:id="73" w:name="stream-monitor-window-0x1000"/>
-      <w:bookmarkEnd w:id="72"/>
+      <w:bookmarkStart w:id="78" w:name="__RefHeading___Toc4438_2204940176"/>
+      <w:bookmarkStart w:id="79" w:name="stream-monitor-window-0x1000"/>
+      <w:bookmarkEnd w:id="78"/>
       <w:r>
         <w:rPr>
           <w:rStyle w:val="SectionNumber"/>
@@ -18893,662 +19316,6 @@
           <w:sz w:val="20"/>
         </w:rPr>
         <w:t>.</w:t>
-      </w:r>
-      <w:bookmarkEnd w:id="73"/>
-    </w:p>
-    <w:p>
-      <w:pPr>
-        <w:pStyle w:val="Heading2"/>
-        <w:pBdr>
-          <w:bottom w:val="single" w:sz="12" w:space="0" w:color="228B22"/>
-        </w:pBdr>
-        <w:spacing w:before="280" w:after="80"/>
-        <w:rPr/>
-      </w:pPr>
-      <w:bookmarkStart w:id="74" w:name="__RefHeading___Toc4384_1236173374"/>
-      <w:bookmarkStart w:id="75" w:name="descriptor-format-desc_ram-0x0002_0000"/>
-      <w:bookmarkEnd w:id="74"/>
-      <w:r>
-        <w:rPr>
-          <w:rStyle w:val="SectionNumber"/>
-          <w:b/>
-          <w:color w:val="228B22"/>
-          <w:sz w:val="28"/>
-        </w:rPr>
-        <w:t>6.6</w:t>
-      </w:r>
-      <w:r>
-        <w:rPr>
-          <w:b/>
-          <w:color w:val="228B22"/>
-          <w:sz w:val="28"/>
-        </w:rPr>
-        <w:tab/>
-        <w:t>Descriptor format (desc_ram @ 0x0002_0000)</w:t>
-      </w:r>
-    </w:p>
-    <w:p>
-      <w:pPr>
-        <w:pStyle w:val="FirstParagraph"/>
-        <w:rPr/>
-      </w:pPr>
-      <w:r>
-        <w:rPr>
-          <w:sz w:val="20"/>
-        </w:rPr>
-        <w:t xml:space="preserve">32 B / 256-bit per descriptor, 8 × 32-bit words: </w:t>
-      </w:r>
-      <w:r>
-        <w:rPr>
-          <w:rStyle w:val="VerbatimChar"/>
-          <w:sz w:val="20"/>
-        </w:rPr>
-        <w:t>src_addr</w:t>
-      </w:r>
-      <w:r>
-        <w:rPr>
-          <w:sz w:val="20"/>
-        </w:rPr>
-        <w:t xml:space="preserve"> lo/hi (w0/1), </w:t>
-      </w:r>
-      <w:r>
-        <w:rPr>
-          <w:rStyle w:val="VerbatimChar"/>
-          <w:sz w:val="20"/>
-        </w:rPr>
-        <w:t>dst_addr</w:t>
-      </w:r>
-      <w:r>
-        <w:rPr>
-          <w:sz w:val="20"/>
-        </w:rPr>
-        <w:t xml:space="preserve"> lo/hi (w2/3), </w:t>
-      </w:r>
-      <w:r>
-        <w:rPr>
-          <w:rStyle w:val="VerbatimChar"/>
-          <w:sz w:val="20"/>
-        </w:rPr>
-        <w:t>length</w:t>
-      </w:r>
-      <w:r>
-        <w:rPr>
-          <w:sz w:val="20"/>
-        </w:rPr>
-        <w:t xml:space="preserve"> in beats (w4), </w:t>
-      </w:r>
-      <w:r>
-        <w:rPr>
-          <w:rStyle w:val="VerbatimChar"/>
-          <w:sz w:val="20"/>
-        </w:rPr>
-        <w:t>next_ptr</w:t>
-      </w:r>
-      <w:r>
-        <w:rPr>
-          <w:sz w:val="20"/>
-        </w:rPr>
-        <w:t xml:space="preserve"> (w5, 0 = end), </w:t>
-      </w:r>
-      <w:r>
-        <w:rPr>
-          <w:rStyle w:val="VerbatimChar"/>
-          <w:sz w:val="20"/>
-        </w:rPr>
-        <w:t>ctrl</w:t>
-      </w:r>
-      <w:r>
-        <w:rPr>
-          <w:sz w:val="20"/>
-        </w:rPr>
-        <w:t xml:space="preserve"> (w6: </w:t>
-      </w:r>
-      <w:r>
-        <w:rPr>
-          <w:rStyle w:val="VerbatimChar"/>
-          <w:sz w:val="20"/>
-        </w:rPr>
-        <w:t>valid[0]</w:t>
-      </w:r>
-      <w:r>
-        <w:rPr>
-          <w:sz w:val="20"/>
-        </w:rPr>
-        <w:t xml:space="preserve">, </w:t>
-      </w:r>
-      <w:r>
-        <w:rPr>
-          <w:rStyle w:val="VerbatimChar"/>
-          <w:sz w:val="20"/>
-        </w:rPr>
-        <w:t>interrupt[1]</w:t>
-      </w:r>
-      <w:r>
-        <w:rPr>
-          <w:sz w:val="20"/>
-        </w:rPr>
-        <w:t xml:space="preserve">, </w:t>
-      </w:r>
-      <w:r>
-        <w:rPr>
-          <w:rStyle w:val="VerbatimChar"/>
-          <w:sz w:val="20"/>
-        </w:rPr>
-        <w:t>last[2]</w:t>
-      </w:r>
-      <w:r>
-        <w:rPr>
-          <w:sz w:val="20"/>
-        </w:rPr>
-        <w:t xml:space="preserve">, </w:t>
-      </w:r>
-      <w:r>
-        <w:rPr>
-          <w:rStyle w:val="VerbatimChar"/>
-          <w:sz w:val="20"/>
-        </w:rPr>
-        <w:t>error[3]</w:t>
-      </w:r>
-      <w:r>
-        <w:rPr>
-          <w:sz w:val="20"/>
-        </w:rPr>
-        <w:t xml:space="preserve">, </w:t>
-      </w:r>
-      <w:r>
-        <w:rPr>
-          <w:rStyle w:val="VerbatimChar"/>
-          <w:sz w:val="20"/>
-        </w:rPr>
-        <w:t>channel_id[7:4]</w:t>
-      </w:r>
-      <w:r>
-        <w:rPr>
-          <w:sz w:val="20"/>
-        </w:rPr>
-        <w:t xml:space="preserve">, </w:t>
-      </w:r>
-      <w:r>
-        <w:rPr>
-          <w:rStyle w:val="VerbatimChar"/>
-          <w:sz w:val="20"/>
-        </w:rPr>
-        <w:t>priority[15:8]</w:t>
-      </w:r>
-      <w:r>
-        <w:rPr>
-          <w:sz w:val="20"/>
-        </w:rPr>
-        <w:t xml:space="preserve">, </w:t>
-      </w:r>
-      <w:r>
-        <w:rPr>
-          <w:rStyle w:val="VerbatimChar"/>
-          <w:sz w:val="20"/>
-        </w:rPr>
-        <w:t>stamp[31:16]</w:t>
-      </w:r>
-      <w:r>
-        <w:rPr>
-          <w:sz w:val="20"/>
-        </w:rPr>
-        <w:t xml:space="preserve">), reserved (w7). Built by </w:t>
-      </w:r>
-      <w:r>
-        <w:rPr>
-          <w:rStyle w:val="VerbatimChar"/>
-          <w:sz w:val="20"/>
-        </w:rPr>
-        <w:t>host/descriptor_builder.py</w:t>
-      </w:r>
-      <w:r>
-        <w:rPr>
-          <w:sz w:val="20"/>
-        </w:rPr>
-        <w:t>.</w:t>
-      </w:r>
-      <w:bookmarkEnd w:id="59"/>
-      <w:bookmarkEnd w:id="75"/>
-    </w:p>
-    <w:p>
-      <w:pPr>
-        <w:pStyle w:val="Heading1"/>
-        <w:shd w:val="clear" w:color="auto" w:fill="404040"/>
-        <w:spacing w:before="360" w:after="120"/>
-        <w:rPr/>
-      </w:pPr>
-      <w:bookmarkStart w:id="76" w:name="__RefHeading___Toc4386_1236173374"/>
-      <w:bookmarkStart w:id="77" w:name="simulation-silicon-equivalence"/>
-      <w:bookmarkEnd w:id="76"/>
-      <w:r>
-        <w:rPr>
-          <w:rStyle w:val="SectionNumber"/>
-          <w:b/>
-          <w:color w:val="FFFFFF"/>
-          <w:sz w:val="32"/>
-        </w:rPr>
-        <w:t>7</w:t>
-      </w:r>
-      <w:r>
-        <w:rPr>
-          <w:b/>
-          <w:color w:val="FFFFFF"/>
-          <w:sz w:val="32"/>
-        </w:rPr>
-        <w:tab/>
-        <w:t>Simulation / Silicon Equivalence</w:t>
-      </w:r>
-    </w:p>
-    <w:p>
-      <w:pPr>
-        <w:pStyle w:val="FirstParagraph"/>
-        <w:rPr/>
-      </w:pPr>
-      <w:r>
-        <w:rPr>
-          <w:sz w:val="20"/>
-        </w:rPr>
-        <w:t xml:space="preserve">The primary </w:t>
-      </w:r>
-      <w:r>
-        <w:rPr>
-          <w:rStyle w:val="VerbatimChar"/>
-          <w:sz w:val="20"/>
-        </w:rPr>
-        <w:t>flows-stream-bridge</w:t>
-      </w:r>
-      <w:r>
-        <w:rPr>
-          <w:sz w:val="20"/>
-        </w:rPr>
-        <w:t xml:space="preserve"> flow has a real </w:t>
-      </w:r>
-      <w:r>
-        <w:rPr>
-          <w:b/>
-          <w:bCs/>
-          <w:sz w:val="20"/>
-        </w:rPr>
-        <w:t>UART-equivalence</w:t>
-      </w:r>
-      <w:r>
-        <w:rPr>
-          <w:sz w:val="20"/>
-        </w:rPr>
-        <w:t xml:space="preserve"> cocotb sim: the testbench drives the </w:t>
-      </w:r>
-      <w:r>
-        <w:rPr>
-          <w:i/>
-          <w:iCs/>
-          <w:sz w:val="20"/>
-        </w:rPr>
-        <w:t>same</w:t>
-      </w:r>
-      <w:r>
-        <w:rPr>
-          <w:sz w:val="20"/>
-        </w:rPr>
-        <w:t xml:space="preserve"> </w:t>
-      </w:r>
-      <w:r>
-        <w:rPr>
-          <w:rStyle w:val="VerbatimChar"/>
-          <w:sz w:val="20"/>
-        </w:rPr>
-        <w:t>uart_axil_bridge</w:t>
-      </w:r>
-      <w:r>
-        <w:rPr>
-          <w:sz w:val="20"/>
-        </w:rPr>
-        <w:t xml:space="preserve"> RTL over the </w:t>
-      </w:r>
-      <w:r>
-        <w:rPr>
-          <w:i/>
-          <w:iCs/>
-          <w:sz w:val="20"/>
-        </w:rPr>
-        <w:t>same</w:t>
-      </w:r>
-      <w:r>
-        <w:rPr>
-          <w:sz w:val="20"/>
-        </w:rPr>
-        <w:t xml:space="preserve"> ASCII </w:t>
-      </w:r>
-      <w:r>
-        <w:rPr>
-          <w:rStyle w:val="VerbatimChar"/>
-          <w:sz w:val="20"/>
-        </w:rPr>
-        <w:t>W/R</w:t>
-      </w:r>
-      <w:r>
-        <w:rPr>
-          <w:sz w:val="20"/>
-        </w:rPr>
-        <w:t xml:space="preserve"> byte stream the FPGA host uses, and the extended-addressing tests run the </w:t>
-      </w:r>
-      <w:r>
-        <w:rPr>
-          <w:i/>
-          <w:iCs/>
-          <w:sz w:val="20"/>
-        </w:rPr>
-        <w:t>same</w:t>
-      </w:r>
-      <w:r>
-        <w:rPr>
-          <w:sz w:val="20"/>
-        </w:rPr>
-        <w:t xml:space="preserve"> Python host programs. Only the bottom transport differs.</w:t>
-      </w:r>
-    </w:p>
-    <w:p>
-      <w:pPr>
-        <w:pStyle w:val="Heading2"/>
-        <w:pBdr>
-          <w:bottom w:val="single" w:sz="12" w:space="0" w:color="228B22"/>
-        </w:pBdr>
-        <w:spacing w:before="280" w:after="80"/>
-        <w:rPr/>
-      </w:pPr>
-      <w:bookmarkStart w:id="78" w:name="__RefHeading___Toc4388_1236173374"/>
-      <w:bookmarkStart w:id="79" w:name="the-testbench"/>
-      <w:bookmarkEnd w:id="78"/>
-      <w:r>
-        <w:rPr>
-          <w:rStyle w:val="SectionNumber"/>
-          <w:b/>
-          <w:color w:val="228B22"/>
-          <w:sz w:val="28"/>
-        </w:rPr>
-        <w:t>7.1</w:t>
-      </w:r>
-      <w:r>
-        <w:rPr>
-          <w:b/>
-          <w:color w:val="228B22"/>
-          <w:sz w:val="28"/>
-        </w:rPr>
-        <w:tab/>
-        <w:t>The testbench</w:t>
-      </w:r>
-    </w:p>
-    <w:p>
-      <w:pPr>
-        <w:pStyle w:val="Compact"/>
-        <w:numPr>
-          <w:ilvl w:val="0"/>
-          <w:numId w:val="9"/>
-        </w:numPr>
-        <w:rPr/>
-      </w:pPr>
-      <w:r>
-        <w:rPr>
-          <w:b/>
-          <w:bCs/>
-        </w:rPr>
-        <w:t>TB:</w:t>
-      </w:r>
-      <w:r>
-        <w:rPr/>
-        <w:t xml:space="preserve"> </w:t>
-      </w:r>
-      <w:r>
-        <w:rPr>
-          <w:rStyle w:val="VerbatimChar"/>
-        </w:rPr>
-        <w:t>flows-stream-bridge/dv/tbclasses/stream_char_tb.py</w:t>
-      </w:r>
-      <w:r>
-        <w:rPr/>
-        <w:t xml:space="preserve"> (</w:t>
-      </w:r>
-      <w:r>
-        <w:rPr>
-          <w:rStyle w:val="VerbatimChar"/>
-        </w:rPr>
-        <w:t>StreamCharTB</w:t>
-      </w:r>
-      <w:r>
-        <w:rPr/>
-        <w:t xml:space="preserve">). Drives </w:t>
-      </w:r>
-      <w:r>
-        <w:rPr>
-          <w:rStyle w:val="VerbatimChar"/>
-        </w:rPr>
-        <w:t>i_uart_rx</w:t>
-      </w:r>
-      <w:r>
-        <w:rPr/>
-        <w:t xml:space="preserve"> / </w:t>
-      </w:r>
-      <w:r>
-        <w:rPr>
-          <w:rStyle w:val="VerbatimChar"/>
-        </w:rPr>
-        <w:t>o_uart_tx</w:t>
-      </w:r>
-      <w:r>
-        <w:rPr/>
-        <w:t xml:space="preserve"> via the CocoTBFramework </w:t>
-      </w:r>
-      <w:r>
-        <w:rPr>
-          <w:rStyle w:val="VerbatimChar"/>
-        </w:rPr>
-        <w:t>UARTMaster</w:t>
-      </w:r>
-      <w:r>
-        <w:rPr/>
-        <w:t xml:space="preserve"> / </w:t>
-      </w:r>
-      <w:r>
-        <w:rPr>
-          <w:rStyle w:val="VerbatimChar"/>
-        </w:rPr>
-        <w:t>UARTMonitor</w:t>
-      </w:r>
-      <w:r>
-        <w:rPr/>
-        <w:t xml:space="preserve"> BFMs; </w:t>
-      </w:r>
-      <w:r>
-        <w:rPr>
-          <w:rStyle w:val="VerbatimChar"/>
-        </w:rPr>
-        <w:t>UART_BAUD</w:t>
-      </w:r>
-      <w:r>
-        <w:rPr/>
-        <w:t xml:space="preserve"> is raised (</w:t>
-      </w:r>
-      <w:r>
-        <w:rPr>
-          <w:rStyle w:val="VerbatimChar"/>
-        </w:rPr>
-        <w:t>CLKS_PER_BIT = 8</w:t>
-      </w:r>
-      <w:r>
-        <w:rPr/>
-        <w:t>) for sim speed — bit-timing only, the byte stream is unchanged. Registers are addressed by name (</w:t>
-      </w:r>
-      <w:r>
-        <w:rPr>
-          <w:rStyle w:val="VerbatimChar"/>
-        </w:rPr>
-        <w:t>stream_addrs.A</w:t>
-      </w:r>
-      <w:r>
-        <w:rPr/>
-        <w:t xml:space="preserve">, </w:t>
-      </w:r>
-      <w:r>
-        <w:rPr>
-          <w:rStyle w:val="VerbatimChar"/>
-        </w:rPr>
-        <w:t>harness_addrs.H</w:t>
-      </w:r>
-      <w:r>
-        <w:rPr/>
-        <w:t>).</w:t>
-      </w:r>
-    </w:p>
-    <w:p>
-      <w:pPr>
-        <w:pStyle w:val="Compact"/>
-        <w:numPr>
-          <w:ilvl w:val="0"/>
-          <w:numId w:val="10"/>
-        </w:numPr>
-        <w:rPr/>
-      </w:pPr>
-      <w:r>
-        <w:rPr>
-          <w:b/>
-          <w:bCs/>
-        </w:rPr>
-        <w:t>Backend model:</w:t>
-      </w:r>
-      <w:r>
-        <w:rPr/>
-        <w:t xml:space="preserve"> the real harness RTL, elaborated in Verilator — </w:t>
-      </w:r>
-      <w:r>
-        <w:rPr>
-          <w:rStyle w:val="VerbatimChar"/>
-        </w:rPr>
-        <w:t>axi4_dma_slaves</w:t>
-      </w:r>
-      <w:r>
-        <w:rPr/>
-        <w:t xml:space="preserve"> (LFSR pattern-gen source + CRC-check sink), </w:t>
-      </w:r>
-      <w:r>
-        <w:rPr>
-          <w:rStyle w:val="VerbatimChar"/>
-        </w:rPr>
-        <w:t>axi_response_delay</w:t>
-      </w:r>
-      <w:r>
-        <w:rPr/>
-        <w:t xml:space="preserve">, </w:t>
-      </w:r>
-      <w:r>
-        <w:rPr>
-          <w:rStyle w:val="VerbatimChar"/>
-        </w:rPr>
-        <w:t>axi4_dma_observer</w:t>
-      </w:r>
-      <w:r>
-        <w:rPr/>
-        <w:t xml:space="preserve">. Descriptors are built by the shared </w:t>
-      </w:r>
-      <w:r>
-        <w:rPr>
-          <w:rStyle w:val="VerbatimChar"/>
-        </w:rPr>
-        <w:t>host/descriptor_builder.py</w:t>
-      </w:r>
-      <w:r>
-        <w:rPr/>
-        <w:t>.</w:t>
-      </w:r>
-    </w:p>
-    <w:p>
-      <w:pPr>
-        <w:pStyle w:val="Compact"/>
-        <w:numPr>
-          <w:ilvl w:val="0"/>
-          <w:numId w:val="11"/>
-        </w:numPr>
-        <w:rPr/>
-      </w:pPr>
-      <w:r>
-        <w:rPr>
-          <w:b/>
-          <w:bCs/>
-        </w:rPr>
-        <w:t>Running the actual host program in sim:</w:t>
-      </w:r>
-      <w:r>
-        <w:rPr/>
-        <w:t xml:space="preserve"> the ext-addressing tests execute </w:t>
-      </w:r>
-      <w:r>
-        <w:rPr>
-          <w:rStyle w:val="VerbatimChar"/>
-        </w:rPr>
-        <w:t>stream_ext_suite.run_suite</w:t>
-      </w:r>
-      <w:r>
-        <w:rPr/>
-        <w:t xml:space="preserve"> / </w:t>
-      </w:r>
-      <w:r>
-        <w:rPr>
-          <w:rStyle w:val="VerbatimChar"/>
-        </w:rPr>
-        <w:t>stream_ext_char</w:t>
-      </w:r>
-      <w:r>
-        <w:rPr/>
-        <w:t xml:space="preserve"> under </w:t>
-      </w:r>
-      <w:r>
-        <w:rPr>
-          <w:rStyle w:val="VerbatimChar"/>
-        </w:rPr>
-        <w:t>await cocotb.external(program)()</w:t>
-      </w:r>
-      <w:r>
-        <w:rPr/>
-        <w:t xml:space="preserve">, with a </w:t>
-      </w:r>
-      <w:r>
-        <w:rPr>
-          <w:rStyle w:val="VerbatimChar"/>
-        </w:rPr>
-        <w:t>_Bridge</w:t>
-      </w:r>
-      <w:r>
-        <w:rPr/>
-        <w:t xml:space="preserve"> shim wrapping </w:t>
-      </w:r>
-      <w:r>
-        <w:rPr>
-          <w:rStyle w:val="VerbatimChar"/>
-        </w:rPr>
-        <w:t>cocotb.function(uart_write / uart_read)</w:t>
-      </w:r>
-      <w:r>
-        <w:rPr/>
-        <w:t xml:space="preserve"> — the shared harness methodology (a </w:t>
-      </w:r>
-      <w:r>
-        <w:rPr>
-          <w:rStyle w:val="VerbatimChar"/>
-        </w:rPr>
-        <w:t>cocotb.function</w:t>
-      </w:r>
-      <w:r>
-        <w:rPr/>
-        <w:t xml:space="preserve"> transport, </w:t>
-      </w:r>
-      <w:r>
-        <w:rPr>
-          <w:b/>
-          <w:bCs/>
-        </w:rPr>
-        <w:t>not</w:t>
-      </w:r>
-      <w:r>
-        <w:rPr/>
-        <w:t xml:space="preserve"> a free-running pump). This is the same-source silicon-equivalence path.</w:t>
       </w:r>
       <w:bookmarkEnd w:id="79"/>
     </w:p>
@@ -19561,8 +19328,8 @@
         <w:spacing w:before="280" w:after="80"/>
         <w:rPr/>
       </w:pPr>
-      <w:bookmarkStart w:id="80" w:name="__RefHeading___Toc4390_1236173374"/>
-      <w:bookmarkStart w:id="81" w:name="test-levels"/>
+      <w:bookmarkStart w:id="80" w:name="__RefHeading___Toc4440_2204940176"/>
+      <w:bookmarkStart w:id="81" w:name="descriptor-format-desc_ram-0x0002_0000"/>
       <w:bookmarkEnd w:id="80"/>
       <w:r>
         <w:rPr>
@@ -19571,7 +19338,7 @@
           <w:color w:val="228B22"/>
           <w:sz w:val="28"/>
         </w:rPr>
-        <w:t>7.2</w:t>
+        <w:t>6.6</w:t>
       </w:r>
       <w:r>
         <w:rPr>
@@ -19580,7 +19347,7 @@
           <w:sz w:val="28"/>
         </w:rPr>
         <w:tab/>
-        <w:t>Test levels</w:t>
+        <w:t>Descriptor format (desc_ram @ 0x0002_0000)</w:t>
       </w:r>
     </w:p>
     <w:p>
@@ -19590,6 +19357,662 @@
       </w:pPr>
       <w:r>
         <w:rPr>
+          <w:sz w:val="20"/>
+        </w:rPr>
+        <w:t xml:space="preserve">32 B / 256-bit per descriptor, 8 × 32-bit words: </w:t>
+      </w:r>
+      <w:r>
+        <w:rPr>
+          <w:rStyle w:val="VerbatimChar"/>
+          <w:sz w:val="20"/>
+        </w:rPr>
+        <w:t>src_addr</w:t>
+      </w:r>
+      <w:r>
+        <w:rPr>
+          <w:sz w:val="20"/>
+        </w:rPr>
+        <w:t xml:space="preserve"> lo/hi (w0/1), </w:t>
+      </w:r>
+      <w:r>
+        <w:rPr>
+          <w:rStyle w:val="VerbatimChar"/>
+          <w:sz w:val="20"/>
+        </w:rPr>
+        <w:t>dst_addr</w:t>
+      </w:r>
+      <w:r>
+        <w:rPr>
+          <w:sz w:val="20"/>
+        </w:rPr>
+        <w:t xml:space="preserve"> lo/hi (w2/3), </w:t>
+      </w:r>
+      <w:r>
+        <w:rPr>
+          <w:rStyle w:val="VerbatimChar"/>
+          <w:sz w:val="20"/>
+        </w:rPr>
+        <w:t>length</w:t>
+      </w:r>
+      <w:r>
+        <w:rPr>
+          <w:sz w:val="20"/>
+        </w:rPr>
+        <w:t xml:space="preserve"> in beats (w4), </w:t>
+      </w:r>
+      <w:r>
+        <w:rPr>
+          <w:rStyle w:val="VerbatimChar"/>
+          <w:sz w:val="20"/>
+        </w:rPr>
+        <w:t>next_ptr</w:t>
+      </w:r>
+      <w:r>
+        <w:rPr>
+          <w:sz w:val="20"/>
+        </w:rPr>
+        <w:t xml:space="preserve"> (w5, 0 = end), </w:t>
+      </w:r>
+      <w:r>
+        <w:rPr>
+          <w:rStyle w:val="VerbatimChar"/>
+          <w:sz w:val="20"/>
+        </w:rPr>
+        <w:t>ctrl</w:t>
+      </w:r>
+      <w:r>
+        <w:rPr>
+          <w:sz w:val="20"/>
+        </w:rPr>
+        <w:t xml:space="preserve"> (w6: </w:t>
+      </w:r>
+      <w:r>
+        <w:rPr>
+          <w:rStyle w:val="VerbatimChar"/>
+          <w:sz w:val="20"/>
+        </w:rPr>
+        <w:t>valid[0]</w:t>
+      </w:r>
+      <w:r>
+        <w:rPr>
+          <w:sz w:val="20"/>
+        </w:rPr>
+        <w:t xml:space="preserve">, </w:t>
+      </w:r>
+      <w:r>
+        <w:rPr>
+          <w:rStyle w:val="VerbatimChar"/>
+          <w:sz w:val="20"/>
+        </w:rPr>
+        <w:t>interrupt[1]</w:t>
+      </w:r>
+      <w:r>
+        <w:rPr>
+          <w:sz w:val="20"/>
+        </w:rPr>
+        <w:t xml:space="preserve">, </w:t>
+      </w:r>
+      <w:r>
+        <w:rPr>
+          <w:rStyle w:val="VerbatimChar"/>
+          <w:sz w:val="20"/>
+        </w:rPr>
+        <w:t>last[2]</w:t>
+      </w:r>
+      <w:r>
+        <w:rPr>
+          <w:sz w:val="20"/>
+        </w:rPr>
+        <w:t xml:space="preserve">, </w:t>
+      </w:r>
+      <w:r>
+        <w:rPr>
+          <w:rStyle w:val="VerbatimChar"/>
+          <w:sz w:val="20"/>
+        </w:rPr>
+        <w:t>error[3]</w:t>
+      </w:r>
+      <w:r>
+        <w:rPr>
+          <w:sz w:val="20"/>
+        </w:rPr>
+        <w:t xml:space="preserve">, </w:t>
+      </w:r>
+      <w:r>
+        <w:rPr>
+          <w:rStyle w:val="VerbatimChar"/>
+          <w:sz w:val="20"/>
+        </w:rPr>
+        <w:t>channel_id[7:4]</w:t>
+      </w:r>
+      <w:r>
+        <w:rPr>
+          <w:sz w:val="20"/>
+        </w:rPr>
+        <w:t xml:space="preserve">, </w:t>
+      </w:r>
+      <w:r>
+        <w:rPr>
+          <w:rStyle w:val="VerbatimChar"/>
+          <w:sz w:val="20"/>
+        </w:rPr>
+        <w:t>priority[15:8]</w:t>
+      </w:r>
+      <w:r>
+        <w:rPr>
+          <w:sz w:val="20"/>
+        </w:rPr>
+        <w:t xml:space="preserve">, </w:t>
+      </w:r>
+      <w:r>
+        <w:rPr>
+          <w:rStyle w:val="VerbatimChar"/>
+          <w:sz w:val="20"/>
+        </w:rPr>
+        <w:t>stamp[31:16]</w:t>
+      </w:r>
+      <w:r>
+        <w:rPr>
+          <w:sz w:val="20"/>
+        </w:rPr>
+        <w:t xml:space="preserve">), reserved (w7). Built by </w:t>
+      </w:r>
+      <w:r>
+        <w:rPr>
+          <w:rStyle w:val="VerbatimChar"/>
+          <w:sz w:val="20"/>
+        </w:rPr>
+        <w:t>host/descriptor_builder.py</w:t>
+      </w:r>
+      <w:r>
+        <w:rPr>
+          <w:sz w:val="20"/>
+        </w:rPr>
+        <w:t>.</w:t>
+      </w:r>
+      <w:bookmarkEnd w:id="65"/>
+      <w:bookmarkEnd w:id="81"/>
+    </w:p>
+    <w:p>
+      <w:pPr>
+        <w:pStyle w:val="Heading1"/>
+        <w:shd w:val="clear" w:color="auto" w:fill="404040"/>
+        <w:spacing w:before="360" w:after="120"/>
+        <w:rPr/>
+      </w:pPr>
+      <w:bookmarkStart w:id="82" w:name="__RefHeading___Toc4442_2204940176"/>
+      <w:bookmarkStart w:id="83" w:name="simulation-silicon-equivalence"/>
+      <w:bookmarkEnd w:id="82"/>
+      <w:r>
+        <w:rPr>
+          <w:rStyle w:val="SectionNumber"/>
+          <w:b/>
+          <w:color w:val="FFFFFF"/>
+          <w:sz w:val="32"/>
+        </w:rPr>
+        <w:t>7</w:t>
+      </w:r>
+      <w:r>
+        <w:rPr>
+          <w:b/>
+          <w:color w:val="FFFFFF"/>
+          <w:sz w:val="32"/>
+        </w:rPr>
+        <w:tab/>
+        <w:t>Simulation / Silicon Equivalence</w:t>
+      </w:r>
+    </w:p>
+    <w:p>
+      <w:pPr>
+        <w:pStyle w:val="FirstParagraph"/>
+        <w:rPr/>
+      </w:pPr>
+      <w:r>
+        <w:rPr>
+          <w:sz w:val="20"/>
+        </w:rPr>
+        <w:t xml:space="preserve">The primary </w:t>
+      </w:r>
+      <w:r>
+        <w:rPr>
+          <w:rStyle w:val="VerbatimChar"/>
+          <w:sz w:val="20"/>
+        </w:rPr>
+        <w:t>flows-stream-bridge</w:t>
+      </w:r>
+      <w:r>
+        <w:rPr>
+          <w:sz w:val="20"/>
+        </w:rPr>
+        <w:t xml:space="preserve"> flow has a real </w:t>
+      </w:r>
+      <w:r>
+        <w:rPr>
+          <w:b/>
+          <w:bCs/>
+          <w:sz w:val="20"/>
+        </w:rPr>
+        <w:t>UART-equivalence</w:t>
+      </w:r>
+      <w:r>
+        <w:rPr>
+          <w:sz w:val="20"/>
+        </w:rPr>
+        <w:t xml:space="preserve"> cocotb sim: the testbench drives the </w:t>
+      </w:r>
+      <w:r>
+        <w:rPr>
+          <w:i/>
+          <w:iCs/>
+          <w:sz w:val="20"/>
+        </w:rPr>
+        <w:t>same</w:t>
+      </w:r>
+      <w:r>
+        <w:rPr>
+          <w:sz w:val="20"/>
+        </w:rPr>
+        <w:t xml:space="preserve"> </w:t>
+      </w:r>
+      <w:r>
+        <w:rPr>
+          <w:rStyle w:val="VerbatimChar"/>
+          <w:sz w:val="20"/>
+        </w:rPr>
+        <w:t>uart_axil_bridge</w:t>
+      </w:r>
+      <w:r>
+        <w:rPr>
+          <w:sz w:val="20"/>
+        </w:rPr>
+        <w:t xml:space="preserve"> RTL over the </w:t>
+      </w:r>
+      <w:r>
+        <w:rPr>
+          <w:i/>
+          <w:iCs/>
+          <w:sz w:val="20"/>
+        </w:rPr>
+        <w:t>same</w:t>
+      </w:r>
+      <w:r>
+        <w:rPr>
+          <w:sz w:val="20"/>
+        </w:rPr>
+        <w:t xml:space="preserve"> ASCII </w:t>
+      </w:r>
+      <w:r>
+        <w:rPr>
+          <w:rStyle w:val="VerbatimChar"/>
+          <w:sz w:val="20"/>
+        </w:rPr>
+        <w:t>W/R</w:t>
+      </w:r>
+      <w:r>
+        <w:rPr>
+          <w:sz w:val="20"/>
+        </w:rPr>
+        <w:t xml:space="preserve"> byte stream the FPGA host uses, and the extended-addressing tests run the </w:t>
+      </w:r>
+      <w:r>
+        <w:rPr>
+          <w:i/>
+          <w:iCs/>
+          <w:sz w:val="20"/>
+        </w:rPr>
+        <w:t>same</w:t>
+      </w:r>
+      <w:r>
+        <w:rPr>
+          <w:sz w:val="20"/>
+        </w:rPr>
+        <w:t xml:space="preserve"> Python host programs. Only the bottom transport differs.</w:t>
+      </w:r>
+    </w:p>
+    <w:p>
+      <w:pPr>
+        <w:pStyle w:val="Heading2"/>
+        <w:pBdr>
+          <w:bottom w:val="single" w:sz="12" w:space="0" w:color="228B22"/>
+        </w:pBdr>
+        <w:spacing w:before="280" w:after="80"/>
+        <w:rPr/>
+      </w:pPr>
+      <w:bookmarkStart w:id="84" w:name="__RefHeading___Toc4444_2204940176"/>
+      <w:bookmarkStart w:id="85" w:name="the-testbench"/>
+      <w:bookmarkEnd w:id="84"/>
+      <w:r>
+        <w:rPr>
+          <w:rStyle w:val="SectionNumber"/>
+          <w:b/>
+          <w:color w:val="228B22"/>
+          <w:sz w:val="28"/>
+        </w:rPr>
+        <w:t>7.1</w:t>
+      </w:r>
+      <w:r>
+        <w:rPr>
+          <w:b/>
+          <w:color w:val="228B22"/>
+          <w:sz w:val="28"/>
+        </w:rPr>
+        <w:tab/>
+        <w:t>The testbench</w:t>
+      </w:r>
+    </w:p>
+    <w:p>
+      <w:pPr>
+        <w:pStyle w:val="Compact"/>
+        <w:numPr>
+          <w:ilvl w:val="0"/>
+          <w:numId w:val="9"/>
+        </w:numPr>
+        <w:rPr/>
+      </w:pPr>
+      <w:r>
+        <w:rPr>
+          <w:b/>
+          <w:bCs/>
+        </w:rPr>
+        <w:t>TB:</w:t>
+      </w:r>
+      <w:r>
+        <w:rPr/>
+        <w:t xml:space="preserve"> </w:t>
+      </w:r>
+      <w:r>
+        <w:rPr>
+          <w:rStyle w:val="VerbatimChar"/>
+        </w:rPr>
+        <w:t>flows-stream-bridge/dv/tbclasses/stream_char_tb.py</w:t>
+      </w:r>
+      <w:r>
+        <w:rPr/>
+        <w:t xml:space="preserve"> (</w:t>
+      </w:r>
+      <w:r>
+        <w:rPr>
+          <w:rStyle w:val="VerbatimChar"/>
+        </w:rPr>
+        <w:t>StreamCharTB</w:t>
+      </w:r>
+      <w:r>
+        <w:rPr/>
+        <w:t xml:space="preserve">). Drives </w:t>
+      </w:r>
+      <w:r>
+        <w:rPr>
+          <w:rStyle w:val="VerbatimChar"/>
+        </w:rPr>
+        <w:t>i_uart_rx</w:t>
+      </w:r>
+      <w:r>
+        <w:rPr/>
+        <w:t xml:space="preserve"> / </w:t>
+      </w:r>
+      <w:r>
+        <w:rPr>
+          <w:rStyle w:val="VerbatimChar"/>
+        </w:rPr>
+        <w:t>o_uart_tx</w:t>
+      </w:r>
+      <w:r>
+        <w:rPr/>
+        <w:t xml:space="preserve"> via the CocoTBFramework </w:t>
+      </w:r>
+      <w:r>
+        <w:rPr>
+          <w:rStyle w:val="VerbatimChar"/>
+        </w:rPr>
+        <w:t>UARTMaster</w:t>
+      </w:r>
+      <w:r>
+        <w:rPr/>
+        <w:t xml:space="preserve"> / </w:t>
+      </w:r>
+      <w:r>
+        <w:rPr>
+          <w:rStyle w:val="VerbatimChar"/>
+        </w:rPr>
+        <w:t>UARTMonitor</w:t>
+      </w:r>
+      <w:r>
+        <w:rPr/>
+        <w:t xml:space="preserve"> BFMs; </w:t>
+      </w:r>
+      <w:r>
+        <w:rPr>
+          <w:rStyle w:val="VerbatimChar"/>
+        </w:rPr>
+        <w:t>UART_BAUD</w:t>
+      </w:r>
+      <w:r>
+        <w:rPr/>
+        <w:t xml:space="preserve"> is raised (</w:t>
+      </w:r>
+      <w:r>
+        <w:rPr>
+          <w:rStyle w:val="VerbatimChar"/>
+        </w:rPr>
+        <w:t>CLKS_PER_BIT = 8</w:t>
+      </w:r>
+      <w:r>
+        <w:rPr/>
+        <w:t>) for sim speed — bit-timing only, the byte stream is unchanged. Registers are addressed by name (</w:t>
+      </w:r>
+      <w:r>
+        <w:rPr>
+          <w:rStyle w:val="VerbatimChar"/>
+        </w:rPr>
+        <w:t>stream_addrs.A</w:t>
+      </w:r>
+      <w:r>
+        <w:rPr/>
+        <w:t xml:space="preserve">, </w:t>
+      </w:r>
+      <w:r>
+        <w:rPr>
+          <w:rStyle w:val="VerbatimChar"/>
+        </w:rPr>
+        <w:t>harness_addrs.H</w:t>
+      </w:r>
+      <w:r>
+        <w:rPr/>
+        <w:t>).</w:t>
+      </w:r>
+    </w:p>
+    <w:p>
+      <w:pPr>
+        <w:pStyle w:val="Compact"/>
+        <w:numPr>
+          <w:ilvl w:val="0"/>
+          <w:numId w:val="10"/>
+        </w:numPr>
+        <w:rPr/>
+      </w:pPr>
+      <w:r>
+        <w:rPr>
+          <w:b/>
+          <w:bCs/>
+        </w:rPr>
+        <w:t>Backend model:</w:t>
+      </w:r>
+      <w:r>
+        <w:rPr/>
+        <w:t xml:space="preserve"> the real harness RTL, elaborated in Verilator — </w:t>
+      </w:r>
+      <w:r>
+        <w:rPr>
+          <w:rStyle w:val="VerbatimChar"/>
+        </w:rPr>
+        <w:t>axi4_dma_slaves</w:t>
+      </w:r>
+      <w:r>
+        <w:rPr/>
+        <w:t xml:space="preserve"> (LFSR pattern-gen source + CRC-check sink), </w:t>
+      </w:r>
+      <w:r>
+        <w:rPr>
+          <w:rStyle w:val="VerbatimChar"/>
+        </w:rPr>
+        <w:t>axi_response_delay</w:t>
+      </w:r>
+      <w:r>
+        <w:rPr/>
+        <w:t xml:space="preserve">, </w:t>
+      </w:r>
+      <w:r>
+        <w:rPr>
+          <w:rStyle w:val="VerbatimChar"/>
+        </w:rPr>
+        <w:t>axi4_dma_observer</w:t>
+      </w:r>
+      <w:r>
+        <w:rPr/>
+        <w:t xml:space="preserve">. Descriptors are built by the shared </w:t>
+      </w:r>
+      <w:r>
+        <w:rPr>
+          <w:rStyle w:val="VerbatimChar"/>
+        </w:rPr>
+        <w:t>host/descriptor_builder.py</w:t>
+      </w:r>
+      <w:r>
+        <w:rPr/>
+        <w:t>.</w:t>
+      </w:r>
+    </w:p>
+    <w:p>
+      <w:pPr>
+        <w:pStyle w:val="Compact"/>
+        <w:numPr>
+          <w:ilvl w:val="0"/>
+          <w:numId w:val="11"/>
+        </w:numPr>
+        <w:rPr/>
+      </w:pPr>
+      <w:r>
+        <w:rPr>
+          <w:b/>
+          <w:bCs/>
+        </w:rPr>
+        <w:t>Running the actual host program in sim:</w:t>
+      </w:r>
+      <w:r>
+        <w:rPr/>
+        <w:t xml:space="preserve"> the ext-addressing tests execute </w:t>
+      </w:r>
+      <w:r>
+        <w:rPr>
+          <w:rStyle w:val="VerbatimChar"/>
+        </w:rPr>
+        <w:t>stream_ext_suite.run_suite</w:t>
+      </w:r>
+      <w:r>
+        <w:rPr/>
+        <w:t xml:space="preserve"> / </w:t>
+      </w:r>
+      <w:r>
+        <w:rPr>
+          <w:rStyle w:val="VerbatimChar"/>
+        </w:rPr>
+        <w:t>stream_ext_char</w:t>
+      </w:r>
+      <w:r>
+        <w:rPr/>
+        <w:t xml:space="preserve"> under </w:t>
+      </w:r>
+      <w:r>
+        <w:rPr>
+          <w:rStyle w:val="VerbatimChar"/>
+        </w:rPr>
+        <w:t>await cocotb.external(program)()</w:t>
+      </w:r>
+      <w:r>
+        <w:rPr/>
+        <w:t xml:space="preserve">, with a </w:t>
+      </w:r>
+      <w:r>
+        <w:rPr>
+          <w:rStyle w:val="VerbatimChar"/>
+        </w:rPr>
+        <w:t>_Bridge</w:t>
+      </w:r>
+      <w:r>
+        <w:rPr/>
+        <w:t xml:space="preserve"> shim wrapping </w:t>
+      </w:r>
+      <w:r>
+        <w:rPr>
+          <w:rStyle w:val="VerbatimChar"/>
+        </w:rPr>
+        <w:t>cocotb.function(uart_write / uart_read)</w:t>
+      </w:r>
+      <w:r>
+        <w:rPr/>
+        <w:t xml:space="preserve"> — the shared harness methodology (a </w:t>
+      </w:r>
+      <w:r>
+        <w:rPr>
+          <w:rStyle w:val="VerbatimChar"/>
+        </w:rPr>
+        <w:t>cocotb.function</w:t>
+      </w:r>
+      <w:r>
+        <w:rPr/>
+        <w:t xml:space="preserve"> transport, </w:t>
+      </w:r>
+      <w:r>
+        <w:rPr>
+          <w:b/>
+          <w:bCs/>
+        </w:rPr>
+        <w:t>not</w:t>
+      </w:r>
+      <w:r>
+        <w:rPr/>
+        <w:t xml:space="preserve"> a free-running pump). This is the same-source silicon-equivalence path.</w:t>
+      </w:r>
+      <w:bookmarkEnd w:id="85"/>
+    </w:p>
+    <w:p>
+      <w:pPr>
+        <w:pStyle w:val="Heading2"/>
+        <w:pBdr>
+          <w:bottom w:val="single" w:sz="12" w:space="0" w:color="228B22"/>
+        </w:pBdr>
+        <w:spacing w:before="280" w:after="80"/>
+        <w:rPr/>
+      </w:pPr>
+      <w:bookmarkStart w:id="86" w:name="__RefHeading___Toc4446_2204940176"/>
+      <w:bookmarkStart w:id="87" w:name="test-levels"/>
+      <w:bookmarkEnd w:id="86"/>
+      <w:r>
+        <w:rPr>
+          <w:rStyle w:val="SectionNumber"/>
+          <w:b/>
+          <w:color w:val="228B22"/>
+          <w:sz w:val="28"/>
+        </w:rPr>
+        <w:t>7.2</w:t>
+      </w:r>
+      <w:r>
+        <w:rPr>
+          <w:b/>
+          <w:color w:val="228B22"/>
+          <w:sz w:val="28"/>
+        </w:rPr>
+        <w:tab/>
+        <w:t>Test levels</w:t>
+      </w:r>
+    </w:p>
+    <w:p>
+      <w:pPr>
+        <w:pStyle w:val="FirstParagraph"/>
+        <w:rPr/>
+      </w:pPr>
+      <w:r>
+        <w:rPr>
           <w:rStyle w:val="VerbatimChar"/>
           <w:sz w:val="20"/>
         </w:rPr>
@@ -19620,12 +20043,12 @@
         <w:pStyle w:val="TableCaption"/>
         <w:rPr/>
       </w:pPr>
-      <w:bookmarkStart w:id="82" w:name="_Tab_14_cocotb_test_levels"/>
+      <w:bookmarkStart w:id="88" w:name="_Tab_14_cocotb_test_levels"/>
       <w:r>
         <w:rPr/>
         <w:t>cocotb test levels</w:t>
       </w:r>
-      <w:bookmarkEnd w:id="82"/>
+      <w:bookmarkEnd w:id="88"/>
     </w:p>
     <w:tbl>
       <w:tblPr>
@@ -20292,7 +20715,7 @@
         </w:rPr>
         <w:t>) so a broken elaboration is caught before a long build.</w:t>
       </w:r>
-      <w:bookmarkEnd w:id="81"/>
+      <w:bookmarkEnd w:id="87"/>
     </w:p>
     <w:p>
       <w:pPr>
@@ -20303,9 +20726,9 @@
         <w:spacing w:before="280" w:after="80"/>
         <w:rPr/>
       </w:pPr>
-      <w:bookmarkStart w:id="83" w:name="__RefHeading___Toc4392_1236173374"/>
-      <w:bookmarkStart w:id="84" w:name="sibling-flows"/>
-      <w:bookmarkEnd w:id="83"/>
+      <w:bookmarkStart w:id="89" w:name="__RefHeading___Toc4448_2204940176"/>
+      <w:bookmarkStart w:id="90" w:name="sibling-flows"/>
+      <w:bookmarkEnd w:id="89"/>
       <w:r>
         <w:rPr>
           <w:rStyle w:val="SectionNumber"/>
@@ -20519,8 +20942,8 @@
         </w:rPr>
         <w:t>) is the basis this TB builds on.</w:t>
       </w:r>
-      <w:bookmarkEnd w:id="77"/>
-      <w:bookmarkEnd w:id="84"/>
+      <w:bookmarkEnd w:id="83"/>
+      <w:bookmarkEnd w:id="90"/>
     </w:p>
     <w:p>
       <w:pPr>
@@ -20529,9 +20952,9 @@
         <w:spacing w:before="360" w:after="120"/>
         <w:rPr/>
       </w:pPr>
-      <w:bookmarkStart w:id="85" w:name="__RefHeading___Toc4394_1236173374"/>
-      <w:bookmarkStart w:id="86" w:name="troubleshooting"/>
-      <w:bookmarkEnd w:id="85"/>
+      <w:bookmarkStart w:id="91" w:name="__RefHeading___Toc4450_2204940176"/>
+      <w:bookmarkStart w:id="92" w:name="troubleshooting"/>
+      <w:bookmarkEnd w:id="91"/>
       <w:r>
         <w:rPr>
           <w:rStyle w:val="SectionNumber"/>
@@ -20560,9 +20983,9 @@
         <w:spacing w:before="280" w:after="80"/>
         <w:rPr/>
       </w:pPr>
-      <w:bookmarkStart w:id="87" w:name="__RefHeading___Toc4396_1236173374"/>
-      <w:bookmarkStart w:id="88" w:name="current-state"/>
-      <w:bookmarkEnd w:id="87"/>
+      <w:bookmarkStart w:id="93" w:name="__RefHeading___Toc4452_2204940176"/>
+      <w:bookmarkStart w:id="94" w:name="current-state"/>
+      <w:bookmarkEnd w:id="93"/>
       <w:r>
         <w:rPr>
           <w:rStyle w:val="SectionNumber"/>
@@ -20645,7 +21068,7 @@
         </w:rPr>
         <w:t xml:space="preserve"> is area + cosim only.</w:t>
       </w:r>
-      <w:bookmarkEnd w:id="88"/>
+      <w:bookmarkEnd w:id="94"/>
     </w:p>
     <w:p>
       <w:pPr>
@@ -20656,8 +21079,8 @@
         <w:spacing w:before="280" w:after="80"/>
         <w:rPr/>
       </w:pPr>
-      <w:bookmarkStart w:id="89" w:name="__RefHeading___Toc4398_1236173374"/>
-      <w:bookmarkEnd w:id="89"/>
+      <w:bookmarkStart w:id="95" w:name="__RefHeading___Toc4454_2204940176"/>
+      <w:bookmarkEnd w:id="95"/>
       <w:r>
         <w:rPr>
           <w:rStyle w:val="SectionNumber"/>
@@ -20682,12 +21105,12 @@
         <w:pStyle w:val="TableCaption"/>
         <w:rPr/>
       </w:pPr>
-      <w:bookmarkStart w:id="90" w:name="_Tab_15_Known_issues_and_wor"/>
+      <w:bookmarkStart w:id="96" w:name="_Tab_15_Known_issues_and_wor"/>
       <w:r>
         <w:rPr/>
         <w:t>Known issues and workarounds</w:t>
       </w:r>
-      <w:bookmarkEnd w:id="90"/>
+      <w:bookmarkEnd w:id="96"/>
     </w:p>
     <w:tbl>
       <w:tblPr>
@@ -21276,8 +21699,8 @@
               </w:rPr>
               <w:t>.</w:t>
             </w:r>
-            <w:bookmarkStart w:id="91" w:name="known-issues"/>
-            <w:bookmarkEnd w:id="91"/>
+            <w:bookmarkStart w:id="97" w:name="known-issues"/>
+            <w:bookmarkEnd w:id="97"/>
           </w:p>
         </w:tc>
       </w:tr>
@@ -21291,8 +21714,8 @@
         <w:spacing w:before="280" w:after="80"/>
         <w:rPr/>
       </w:pPr>
-      <w:bookmarkStart w:id="92" w:name="__RefHeading___Toc4400_1236173374"/>
-      <w:bookmarkEnd w:id="92"/>
+      <w:bookmarkStart w:id="98" w:name="__RefHeading___Toc4456_2204940176"/>
+      <w:bookmarkEnd w:id="98"/>
       <w:r>
         <w:rPr>
           <w:rStyle w:val="SectionNumber"/>
@@ -21411,9 +21834,9 @@
         <w:spacing w:before="280" w:after="80"/>
         <w:rPr/>
       </w:pPr>
-      <w:bookmarkStart w:id="93" w:name="__RefHeading___Toc4402_1236173374"/>
-      <w:bookmarkStart w:id="94" w:name="not-simulatable"/>
-      <w:bookmarkEnd w:id="93"/>
+      <w:bookmarkStart w:id="99" w:name="__RefHeading___Toc4458_2204940176"/>
+      <w:bookmarkStart w:id="100" w:name="not-simulatable"/>
+      <w:bookmarkEnd w:id="99"/>
       <w:r>
         <w:rPr>
           <w:rStyle w:val="SectionNumber"/>
@@ -21438,14 +21861,14 @@
         <w:pStyle w:val="FirstParagraph"/>
         <w:rPr/>
       </w:pPr>
-      <w:bookmarkStart w:id="95" w:name="not-simulatable"/>
+      <w:bookmarkStart w:id="101" w:name="not-simulatable"/>
       <w:r>
         <w:rPr>
           <w:sz w:val="20"/>
         </w:rPr>
         <w:t>The Vivado MCDMA IP is VHDL — Verilator cannot simulate it, so MCDMA validation is FPGA-only. The full iDMA end-to-end (desc64 + backend) is not built (width mismatch); its two halves are characterized separately for the area comparison.</w:t>
       </w:r>
-      <w:bookmarkEnd w:id="95"/>
+      <w:bookmarkEnd w:id="101"/>
     </w:p>
     <w:p>
       <w:pPr>
@@ -21456,9 +21879,9 @@
         <w:spacing w:before="280" w:after="80"/>
         <w:rPr/>
       </w:pPr>
-      <w:bookmarkStart w:id="96" w:name="__RefHeading___Toc4404_1236173374"/>
-      <w:bookmarkStart w:id="97" w:name="board-fit-vs-sim-geometry"/>
-      <w:bookmarkEnd w:id="96"/>
+      <w:bookmarkStart w:id="102" w:name="__RefHeading___Toc4460_2204940176"/>
+      <w:bookmarkStart w:id="103" w:name="board-fit-vs-sim-geometry"/>
+      <w:bookmarkEnd w:id="102"/>
       <w:r>
         <w:rPr>
           <w:rStyle w:val="SectionNumber"/>
@@ -21496,7 +21919,7 @@
         </w:rPr>
         <w:t xml:space="preserve"> is reduced 8 → 4 for sim (Artix BRAM); the as-built characterization bitstream is 8-channel with monitors on (the perf build). Timing closes at +0.031 ns WNS after trimming monitors to perf-only.</w:t>
       </w:r>
-      <w:bookmarkEnd w:id="97"/>
+      <w:bookmarkEnd w:id="103"/>
     </w:p>
     <w:p>
       <w:pPr>
@@ -21507,9 +21930,9 @@
         <w:spacing w:before="280" w:after="80"/>
         <w:rPr/>
       </w:pPr>
-      <w:bookmarkStart w:id="98" w:name="__RefHeading___Toc4406_1236173374"/>
-      <w:bookmarkStart w:id="99" w:name="which-readme-to-trust"/>
-      <w:bookmarkEnd w:id="98"/>
+      <w:bookmarkStart w:id="104" w:name="__RefHeading___Toc4462_2204940176"/>
+      <w:bookmarkStart w:id="105" w:name="which-readme-to-trust"/>
+      <w:bookmarkEnd w:id="104"/>
       <w:r>
         <w:rPr>
           <w:rStyle w:val="SectionNumber"/>
@@ -21633,13 +22056,13 @@
         </w:rPr>
         <w:t xml:space="preserve"> (July 2026), and the regmap generator, over that README.</w:t>
       </w:r>
-      <w:bookmarkEnd w:id="86"/>
-      <w:bookmarkEnd w:id="99"/>
+      <w:bookmarkEnd w:id="92"/>
+      <w:bookmarkEnd w:id="105"/>
     </w:p>
     <w:sectPr>
-      <w:footerReference w:type="even" r:id="rId8"/>
-      <w:footerReference w:type="default" r:id="rId9"/>
-      <w:footerReference w:type="first" r:id="rId10"/>
+      <w:footerReference w:type="even" r:id="rId12"/>
+      <w:footerReference w:type="default" r:id="rId13"/>
+      <w:footerReference w:type="first" r:id="rId14"/>
       <w:type w:val="nextPage"/>
       <w:pgSz w:w="12240" w:h="15840"/>
       <w:pgMar w:left="1440" w:right="1440" w:gutter="0" w:header="0" w:top="1440" w:footer="720" w:bottom="1440"/>
@@ -21774,7 +22197,7 @@
           </w:r>
           <w:r>
             <w:rPr/>
-            <w:t>22</w:t>
+            <w:t>25</w:t>
           </w:r>
           <w:r>
             <w:rPr/>
@@ -21801,7 +22224,7 @@
           </w:r>
           <w:r>
             <w:rPr/>
-            <w:t>22</w:t>
+            <w:t>25</w:t>
           </w:r>
           <w:r>
             <w:rPr/>
@@ -21921,7 +22344,7 @@
           </w:r>
           <w:r>
             <w:rPr/>
-            <w:t>22</w:t>
+            <w:t>25</w:t>
           </w:r>
           <w:r>
             <w:rPr/>
@@ -21948,7 +22371,7 @@
           </w:r>
           <w:r>
             <w:rPr/>
-            <w:t>22</w:t>
+            <w:t>25</w:t>
           </w:r>
           <w:r>
             <w:rPr/>

</xml_diff>